<commit_message>
feat(legal-docs): add new "carta poder" templates and automate placeholder conversion
Integrates new `carta_poder` (power of attorney) document templates for Andres, Don Alex, and Richard into the system.

Updates the `docuseal` schema with corresponding enum values for these new document types.

Introduces a Python script to convert `_______` blanks in `.docx` templates to `{key}` placeholders, standardizing data injection. This script also dynamically maps specific age keys (e.g., `{edadAndres}`, `{edadAlex}`, `{edadRichard}`) based on the template filename.

Several existing `inversiones` templates (cesion_creditos, contrato_servicios_cash_in) were also re-uploaded, likely after undergoing similar placeholder standardization.
</commit_message>
<xml_diff>
--- a/apps/legal-docs-blueprints/templates/inversiones/cesion_creditos/cestion_creditos_hombre.docx
+++ b/apps/legal-docs-blueprints/templates/inversiones/cesion_creditos/cestion_creditos_hombre.docx
@@ -1,6 +1,6 @@
 
 <file path=word/document.xml><?xml version="1.0" encoding="utf-8"?>
-<w:document xmlns:o="urn:schemas-microsoft-com:office:office" xmlns:r="http://schemas.openxmlformats.org/officeDocument/2006/relationships" xmlns:v="urn:schemas-microsoft-com:vml" xmlns:w="http://schemas.openxmlformats.org/wordprocessingml/2006/main" xmlns:w10="urn:schemas-microsoft-com:office:word" xmlns:wp="http://schemas.openxmlformats.org/drawingml/2006/wordprocessingDrawing" xmlns:wps="http://schemas.microsoft.com/office/word/2010/wordprocessingShape" xmlns:wpg="http://schemas.microsoft.com/office/word/2010/wordprocessingGroup" xmlns:mc="http://schemas.openxmlformats.org/markup-compatibility/2006" xmlns:wp14="http://schemas.microsoft.com/office/word/2010/wordprocessingDrawing" xmlns:w14="http://schemas.microsoft.com/office/word/2010/wordml" xmlns:w15="http://schemas.microsoft.com/office/word/2012/wordml" mc:Ignorable="w14 wp14 w15">
+<w:document xmlns:o="urn:schemas-microsoft-com:office:office" xmlns:r="http://schemas.openxmlformats.org/officeDocument/2006/relationships" xmlns:v="urn:schemas-microsoft-com:vml" xmlns:w="http://schemas.openxmlformats.org/wordprocessingml/2006/main" xmlns:w10="urn:schemas-microsoft-com:office:word" xmlns:wp="http://schemas.openxmlformats.org/drawingml/2006/wordprocessingDrawing" xmlns:pic="http://schemas.openxmlformats.org/drawingml/2006/picture" xmlns:wps="http://schemas.microsoft.com/office/word/2010/wordprocessingShape" xmlns:wpg="http://schemas.microsoft.com/office/word/2010/wordprocessingGroup" xmlns:mc="http://schemas.openxmlformats.org/markup-compatibility/2006" xmlns:wp14="http://schemas.microsoft.com/office/word/2010/wordprocessingDrawing" xmlns:w14="http://schemas.microsoft.com/office/word/2010/wordml" xmlns:w15="http://schemas.microsoft.com/office/word/2012/wordml" mc:Ignorable="w14 wp14 w15">
   <w:body>
     <w:p>
       <w:pPr>
@@ -18,15 +18,13 @@
           <w:b w:val="false"/>
           <w:bCs w:val="false"/>
           <w:i w:val="false"/>
-          <w:i w:val="false"/>
-          <w:iCs w:val="false"/>
-          <w:caps w:val="false"/>
-          <w:smallCaps w:val="false"/>
-          <w:strike w:val="false"/>
-          <w:dstrike w:val="false"/>
-          <w:color w:val="000000"/>
-          <w:position w:val="0"/>
-          <w:sz w:val="20"/>
+          <w:iCs w:val="false"/>
+          <w:caps w:val="false"/>
+          <w:smallCaps w:val="false"/>
+          <w:strike w:val="false"/>
+          <w:dstrike w:val="false"/>
+          <w:color w:val="000000"/>
+          <w:position w:val="0"/>
           <w:sz w:val="20"/>
           <w:szCs w:val="20"/>
           <w:u w:val="none"/>
@@ -40,7 +38,7 @@
           <wp:inline distT="0" distB="0" distL="0" distR="0">
             <wp:extent cx="1870710" cy="586740"/>
             <wp:effectExtent l="0" t="0" r="0" b="0"/>
-            <wp:docPr id="1" name="image1.jpg" descr=""/>
+            <wp:docPr id="1" name="image1.jpg"/>
             <wp:cNvGraphicFramePr>
               <a:graphicFrameLocks xmlns:a="http://schemas.openxmlformats.org/drawingml/2006/main" noChangeAspect="1"/>
             </wp:cNvGraphicFramePr>
@@ -48,7 +46,7 @@
               <a:graphicData uri="http://schemas.openxmlformats.org/drawingml/2006/picture">
                 <pic:pic xmlns:pic="http://schemas.openxmlformats.org/drawingml/2006/picture">
                   <pic:nvPicPr>
-                    <pic:cNvPr id="1" name="image1.jpg" descr=""/>
+                    <pic:cNvPr id="1" name="image1.jpg"/>
                     <pic:cNvPicPr>
                       <a:picLocks noChangeAspect="1" noChangeArrowheads="1"/>
                     </pic:cNvPicPr>
@@ -67,6 +65,7 @@
                     <a:prstGeom prst="rect">
                       <a:avLst/>
                     </a:prstGeom>
+                    <a:noFill/>
                   </pic:spPr>
                 </pic:pic>
               </a:graphicData>
@@ -122,36 +121,33 @@
           <w:b/>
           <w:bCs/>
           <w:i w:val="false"/>
-          <w:i w:val="false"/>
-          <w:iCs w:val="false"/>
-          <w:caps w:val="false"/>
-          <w:smallCaps w:val="false"/>
-          <w:strike w:val="false"/>
-          <w:dstrike w:val="false"/>
-          <w:color w:val="000000"/>
-          <w:position w:val="0"/>
-          <w:sz w:val="20"/>
-          <w:sz w:val="20"/>
-          <w:szCs w:val="20"/>
-          <w:u w:val="none"/>
-          <w:shd w:fill="auto" w:val="clear"/>
-          <w:vertAlign w:val="baseline"/>
-        </w:rPr>
-      </w:pPr>
-      <w:r>
-        <w:rPr>
-          <w:rFonts w:eastAsia="Arial" w:cs="Arial"/>
-          <w:b/>
-          <w:bCs/>
-          <w:i w:val="false"/>
-          <w:iCs w:val="false"/>
-          <w:caps w:val="false"/>
-          <w:smallCaps w:val="false"/>
-          <w:strike w:val="false"/>
-          <w:dstrike w:val="false"/>
-          <w:color w:val="000000"/>
-          <w:position w:val="0"/>
-          <w:sz w:val="20"/>
+          <w:iCs w:val="false"/>
+          <w:caps w:val="false"/>
+          <w:smallCaps w:val="false"/>
+          <w:strike w:val="false"/>
+          <w:dstrike w:val="false"/>
+          <w:color w:val="000000"/>
+          <w:position w:val="0"/>
+          <w:sz w:val="20"/>
+          <w:szCs w:val="20"/>
+          <w:u w:val="none"/>
+          <w:shd w:fill="auto" w:val="clear"/>
+          <w:vertAlign w:val="baseline"/>
+        </w:rPr>
+      </w:pPr>
+      <w:r>
+        <w:rPr>
+          <w:rFonts w:eastAsia="Arial" w:cs="Arial"/>
+          <w:b/>
+          <w:bCs/>
+          <w:i w:val="false"/>
+          <w:iCs w:val="false"/>
+          <w:caps w:val="false"/>
+          <w:smallCaps w:val="false"/>
+          <w:strike w:val="false"/>
+          <w:dstrike w:val="false"/>
+          <w:color w:val="000000"/>
+          <w:position w:val="0"/>
           <w:sz w:val="20"/>
           <w:szCs w:val="20"/>
           <w:u w:val="none"/>
@@ -176,36 +172,33 @@
           <w:b/>
           <w:bCs/>
           <w:i w:val="false"/>
-          <w:i w:val="false"/>
-          <w:iCs w:val="false"/>
-          <w:caps w:val="false"/>
-          <w:smallCaps w:val="false"/>
-          <w:strike w:val="false"/>
-          <w:dstrike w:val="false"/>
-          <w:color w:val="000000"/>
-          <w:position w:val="0"/>
-          <w:sz w:val="20"/>
-          <w:sz w:val="20"/>
-          <w:szCs w:val="20"/>
-          <w:u w:val="none"/>
-          <w:shd w:fill="auto" w:val="clear"/>
-          <w:vertAlign w:val="baseline"/>
-        </w:rPr>
-      </w:pPr>
-      <w:r>
-        <w:rPr>
-          <w:rFonts w:eastAsia="Arial" w:cs="Arial"/>
-          <w:b/>
-          <w:bCs/>
-          <w:i w:val="false"/>
-          <w:iCs w:val="false"/>
-          <w:caps w:val="false"/>
-          <w:smallCaps w:val="false"/>
-          <w:strike w:val="false"/>
-          <w:dstrike w:val="false"/>
-          <w:color w:val="000000"/>
-          <w:position w:val="0"/>
-          <w:sz w:val="20"/>
+          <w:iCs w:val="false"/>
+          <w:caps w:val="false"/>
+          <w:smallCaps w:val="false"/>
+          <w:strike w:val="false"/>
+          <w:dstrike w:val="false"/>
+          <w:color w:val="000000"/>
+          <w:position w:val="0"/>
+          <w:sz w:val="20"/>
+          <w:szCs w:val="20"/>
+          <w:u w:val="none"/>
+          <w:shd w:fill="auto" w:val="clear"/>
+          <w:vertAlign w:val="baseline"/>
+        </w:rPr>
+      </w:pPr>
+      <w:r>
+        <w:rPr>
+          <w:rFonts w:eastAsia="Arial" w:cs="Arial"/>
+          <w:b/>
+          <w:bCs/>
+          <w:i w:val="false"/>
+          <w:iCs w:val="false"/>
+          <w:caps w:val="false"/>
+          <w:smallCaps w:val="false"/>
+          <w:strike w:val="false"/>
+          <w:dstrike w:val="false"/>
+          <w:color w:val="000000"/>
+          <w:position w:val="0"/>
           <w:sz w:val="20"/>
           <w:szCs w:val="20"/>
           <w:u w:val="none"/>
@@ -235,36 +228,33 @@
           <w:b w:val="false"/>
           <w:bCs w:val="false"/>
           <w:i w:val="false"/>
-          <w:i w:val="false"/>
-          <w:iCs w:val="false"/>
-          <w:caps w:val="false"/>
-          <w:smallCaps w:val="false"/>
-          <w:strike w:val="false"/>
-          <w:dstrike w:val="false"/>
-          <w:color w:val="000000"/>
-          <w:position w:val="0"/>
-          <w:sz w:val="20"/>
-          <w:sz w:val="20"/>
-          <w:szCs w:val="20"/>
-          <w:u w:val="none"/>
-          <w:shd w:fill="auto" w:val="clear"/>
-          <w:vertAlign w:val="baseline"/>
-        </w:rPr>
-      </w:pPr>
-      <w:r>
-        <w:rPr>
-          <w:rFonts w:eastAsia="Arial" w:cs="Arial"/>
-          <w:b w:val="false"/>
-          <w:bCs w:val="false"/>
-          <w:i w:val="false"/>
-          <w:iCs w:val="false"/>
-          <w:caps w:val="false"/>
-          <w:smallCaps w:val="false"/>
-          <w:strike w:val="false"/>
-          <w:dstrike w:val="false"/>
-          <w:color w:val="000000"/>
-          <w:position w:val="0"/>
-          <w:sz w:val="20"/>
+          <w:iCs w:val="false"/>
+          <w:caps w:val="false"/>
+          <w:smallCaps w:val="false"/>
+          <w:strike w:val="false"/>
+          <w:dstrike w:val="false"/>
+          <w:color w:val="000000"/>
+          <w:position w:val="0"/>
+          <w:sz w:val="20"/>
+          <w:szCs w:val="20"/>
+          <w:u w:val="none"/>
+          <w:shd w:fill="auto" w:val="clear"/>
+          <w:vertAlign w:val="baseline"/>
+        </w:rPr>
+      </w:pPr>
+      <w:r>
+        <w:rPr>
+          <w:rFonts w:eastAsia="Arial" w:cs="Arial"/>
+          <w:b w:val="false"/>
+          <w:bCs w:val="false"/>
+          <w:i w:val="false"/>
+          <w:iCs w:val="false"/>
+          <w:caps w:val="false"/>
+          <w:smallCaps w:val="false"/>
+          <w:strike w:val="false"/>
+          <w:dstrike w:val="false"/>
+          <w:color w:val="000000"/>
+          <w:position w:val="0"/>
           <w:sz w:val="20"/>
           <w:szCs w:val="20"/>
           <w:u w:val="none"/>
@@ -292,7 +282,6 @@
               <w:dstrike w:val="false"/>
               <w:color w:val="000000"/>
               <w:position w:val="0"/>
-              <w:sz w:val="20"/>
               <w:sz w:val="20"/>
               <w:szCs w:val="20"/>
               <w:u w:val="none"/>
@@ -314,7 +303,6 @@
               <w:color w:val="000000"/>
               <w:position w:val="0"/>
               <w:sz w:val="20"/>
-              <w:sz w:val="20"/>
               <w:szCs w:val="20"/>
               <w:u w:val="none"/>
               <w:shd w:fill="auto" w:val="clear"/>
@@ -337,7 +325,6 @@
           <w:color w:val="000000"/>
           <w:position w:val="0"/>
           <w:sz w:val="20"/>
-          <w:sz w:val="20"/>
           <w:szCs w:val="20"/>
           <w:u w:val="none"/>
           <w:shd w:fill="auto" w:val="clear"/>
@@ -358,7 +345,6 @@
           <w:dstrike w:val="false"/>
           <w:color w:val="000000"/>
           <w:position w:val="0"/>
-          <w:sz w:val="20"/>
           <w:sz w:val="20"/>
           <w:szCs w:val="20"/>
           <w:u w:val="none"/>
@@ -436,36 +422,33 @@
           <w:b w:val="false"/>
           <w:bCs w:val="false"/>
           <w:i w:val="false"/>
-          <w:i w:val="false"/>
-          <w:iCs w:val="false"/>
-          <w:caps w:val="false"/>
-          <w:smallCaps w:val="false"/>
-          <w:strike w:val="false"/>
-          <w:dstrike w:val="false"/>
-          <w:color w:val="000000"/>
-          <w:position w:val="0"/>
-          <w:sz w:val="20"/>
-          <w:sz w:val="20"/>
-          <w:szCs w:val="20"/>
-          <w:u w:val="none"/>
-          <w:shd w:fill="auto" w:val="clear"/>
-          <w:vertAlign w:val="baseline"/>
-        </w:rPr>
-      </w:pPr>
-      <w:r>
-        <w:rPr>
-          <w:rFonts w:eastAsia="Arial" w:cs="Arial"/>
-          <w:b w:val="false"/>
-          <w:bCs w:val="false"/>
-          <w:i w:val="false"/>
-          <w:iCs w:val="false"/>
-          <w:caps w:val="false"/>
-          <w:smallCaps w:val="false"/>
-          <w:strike w:val="false"/>
-          <w:dstrike w:val="false"/>
-          <w:color w:val="000000"/>
-          <w:position w:val="0"/>
-          <w:sz w:val="20"/>
+          <w:iCs w:val="false"/>
+          <w:caps w:val="false"/>
+          <w:smallCaps w:val="false"/>
+          <w:strike w:val="false"/>
+          <w:dstrike w:val="false"/>
+          <w:color w:val="000000"/>
+          <w:position w:val="0"/>
+          <w:sz w:val="20"/>
+          <w:szCs w:val="20"/>
+          <w:u w:val="none"/>
+          <w:shd w:fill="auto" w:val="clear"/>
+          <w:vertAlign w:val="baseline"/>
+        </w:rPr>
+      </w:pPr>
+      <w:r>
+        <w:rPr>
+          <w:rFonts w:eastAsia="Arial" w:cs="Arial"/>
+          <w:b w:val="false"/>
+          <w:bCs w:val="false"/>
+          <w:i w:val="false"/>
+          <w:iCs w:val="false"/>
+          <w:caps w:val="false"/>
+          <w:smallCaps w:val="false"/>
+          <w:strike w:val="false"/>
+          <w:dstrike w:val="false"/>
+          <w:color w:val="000000"/>
+          <w:position w:val="0"/>
           <w:sz w:val="20"/>
           <w:szCs w:val="20"/>
           <w:u w:val="none"/>
@@ -495,15 +478,13 @@
           <w:b w:val="false"/>
           <w:bCs w:val="false"/>
           <w:i w:val="false"/>
-          <w:i w:val="false"/>
-          <w:iCs w:val="false"/>
-          <w:caps w:val="false"/>
-          <w:smallCaps w:val="false"/>
-          <w:strike w:val="false"/>
-          <w:dstrike w:val="false"/>
-          <w:color w:val="000000"/>
-          <w:position w:val="0"/>
-          <w:sz w:val="20"/>
+          <w:iCs w:val="false"/>
+          <w:caps w:val="false"/>
+          <w:smallCaps w:val="false"/>
+          <w:strike w:val="false"/>
+          <w:dstrike w:val="false"/>
+          <w:color w:val="000000"/>
+          <w:position w:val="0"/>
           <w:sz w:val="20"/>
           <w:szCs w:val="20"/>
           <w:u w:val="none"/>
@@ -539,7 +520,6 @@
           <w:color w:val="000000"/>
           <w:position w:val="0"/>
           <w:sz w:val="20"/>
-          <w:sz w:val="20"/>
           <w:szCs w:val="20"/>
           <w:u w:val="none"/>
           <w:shd w:fill="auto" w:val="clear"/>
@@ -561,7 +541,6 @@
           <w:color w:val="000000"/>
           <w:position w:val="0"/>
           <w:sz w:val="20"/>
-          <w:sz w:val="20"/>
           <w:szCs w:val="20"/>
           <w:u w:val="none"/>
           <w:shd w:fill="auto" w:val="clear"/>
@@ -589,7 +568,6 @@
           <w:dstrike w:val="false"/>
           <w:color w:val="000000"/>
           <w:position w:val="0"/>
-          <w:sz w:val="20"/>
           <w:sz w:val="20"/>
           <w:szCs w:val="20"/>
           <w:u w:val="none"/>
@@ -617,7 +595,6 @@
               <w:dstrike w:val="false"/>
               <w:color w:val="000000"/>
               <w:position w:val="0"/>
-              <w:sz w:val="20"/>
               <w:sz w:val="20"/>
               <w:szCs w:val="20"/>
               <w:u w:val="none"/>
@@ -639,7 +616,6 @@
               <w:color w:val="000000"/>
               <w:position w:val="0"/>
               <w:sz w:val="20"/>
-              <w:sz w:val="20"/>
               <w:szCs w:val="20"/>
               <w:u w:val="none"/>
               <w:shd w:fill="auto" w:val="clear"/>
@@ -662,7 +638,6 @@
           <w:color w:val="000000"/>
           <w:position w:val="0"/>
           <w:sz w:val="20"/>
-          <w:sz w:val="20"/>
           <w:szCs w:val="20"/>
           <w:u w:val="none"/>
           <w:shd w:fill="auto" w:val="clear"/>
@@ -683,7 +658,6 @@
           <w:dstrike w:val="false"/>
           <w:color w:val="000000"/>
           <w:position w:val="0"/>
-          <w:sz w:val="20"/>
           <w:sz w:val="20"/>
           <w:szCs w:val="20"/>
           <w:u w:val="none"/>
@@ -711,7 +685,6 @@
               <w:dstrike w:val="false"/>
               <w:color w:val="000000"/>
               <w:position w:val="0"/>
-              <w:sz w:val="20"/>
               <w:sz w:val="20"/>
               <w:szCs w:val="20"/>
               <w:u w:val="none"/>
@@ -733,7 +706,6 @@
               <w:color w:val="000000"/>
               <w:position w:val="0"/>
               <w:sz w:val="20"/>
-              <w:sz w:val="20"/>
               <w:szCs w:val="20"/>
               <w:u w:val="none"/>
               <w:shd w:fill="auto" w:val="clear"/>
@@ -756,7 +728,6 @@
           <w:color w:val="000000"/>
           <w:position w:val="0"/>
           <w:sz w:val="20"/>
-          <w:sz w:val="20"/>
           <w:szCs w:val="20"/>
           <w:u w:val="none"/>
           <w:shd w:fill="auto" w:val="clear"/>
@@ -777,7 +748,6 @@
           <w:dstrike w:val="false"/>
           <w:color w:val="000000"/>
           <w:position w:val="0"/>
-          <w:sz w:val="20"/>
           <w:sz w:val="20"/>
           <w:szCs w:val="20"/>
           <w:u w:val="none"/>
@@ -822,36 +792,33 @@
           <w:b w:val="false"/>
           <w:bCs w:val="false"/>
           <w:i w:val="false"/>
-          <w:i w:val="false"/>
-          <w:iCs w:val="false"/>
-          <w:caps w:val="false"/>
-          <w:smallCaps w:val="false"/>
-          <w:strike w:val="false"/>
-          <w:dstrike w:val="false"/>
-          <w:color w:val="000000"/>
-          <w:position w:val="0"/>
-          <w:sz w:val="20"/>
-          <w:sz w:val="20"/>
-          <w:szCs w:val="20"/>
-          <w:u w:val="none"/>
-          <w:shd w:fill="auto" w:val="clear"/>
-          <w:vertAlign w:val="baseline"/>
-        </w:rPr>
-      </w:pPr>
-      <w:r>
-        <w:rPr>
-          <w:rFonts w:eastAsia="Arial" w:cs="Arial"/>
-          <w:b w:val="false"/>
-          <w:bCs w:val="false"/>
-          <w:i w:val="false"/>
-          <w:iCs w:val="false"/>
-          <w:caps w:val="false"/>
-          <w:smallCaps w:val="false"/>
-          <w:strike w:val="false"/>
-          <w:dstrike w:val="false"/>
-          <w:color w:val="000000"/>
-          <w:position w:val="0"/>
-          <w:sz w:val="20"/>
+          <w:iCs w:val="false"/>
+          <w:caps w:val="false"/>
+          <w:smallCaps w:val="false"/>
+          <w:strike w:val="false"/>
+          <w:dstrike w:val="false"/>
+          <w:color w:val="000000"/>
+          <w:position w:val="0"/>
+          <w:sz w:val="20"/>
+          <w:szCs w:val="20"/>
+          <w:u w:val="none"/>
+          <w:shd w:fill="auto" w:val="clear"/>
+          <w:vertAlign w:val="baseline"/>
+        </w:rPr>
+      </w:pPr>
+      <w:r>
+        <w:rPr>
+          <w:rFonts w:eastAsia="Arial" w:cs="Arial"/>
+          <w:b w:val="false"/>
+          <w:bCs w:val="false"/>
+          <w:i w:val="false"/>
+          <w:iCs w:val="false"/>
+          <w:caps w:val="false"/>
+          <w:smallCaps w:val="false"/>
+          <w:strike w:val="false"/>
+          <w:dstrike w:val="false"/>
+          <w:color w:val="000000"/>
+          <w:position w:val="0"/>
           <w:sz w:val="20"/>
           <w:szCs w:val="20"/>
           <w:u w:val="none"/>
@@ -878,36 +845,33 @@
           <w:b w:val="false"/>
           <w:bCs w:val="false"/>
           <w:i w:val="false"/>
-          <w:i w:val="false"/>
-          <w:iCs w:val="false"/>
-          <w:caps w:val="false"/>
-          <w:smallCaps w:val="false"/>
-          <w:strike w:val="false"/>
-          <w:dstrike w:val="false"/>
-          <w:color w:val="000000"/>
-          <w:position w:val="0"/>
-          <w:sz w:val="20"/>
-          <w:sz w:val="20"/>
-          <w:szCs w:val="20"/>
-          <w:u w:val="none"/>
-          <w:shd w:fill="auto" w:val="clear"/>
-          <w:vertAlign w:val="baseline"/>
-        </w:rPr>
-      </w:pPr>
-      <w:r>
-        <w:rPr>
-          <w:rFonts w:eastAsia="Arial" w:cs="Arial"/>
-          <w:b w:val="false"/>
-          <w:bCs w:val="false"/>
-          <w:i w:val="false"/>
-          <w:iCs w:val="false"/>
-          <w:caps w:val="false"/>
-          <w:smallCaps w:val="false"/>
-          <w:strike w:val="false"/>
-          <w:dstrike w:val="false"/>
-          <w:color w:val="000000"/>
-          <w:position w:val="0"/>
-          <w:sz w:val="20"/>
+          <w:iCs w:val="false"/>
+          <w:caps w:val="false"/>
+          <w:smallCaps w:val="false"/>
+          <w:strike w:val="false"/>
+          <w:dstrike w:val="false"/>
+          <w:color w:val="000000"/>
+          <w:position w:val="0"/>
+          <w:sz w:val="20"/>
+          <w:szCs w:val="20"/>
+          <w:u w:val="none"/>
+          <w:shd w:fill="auto" w:val="clear"/>
+          <w:vertAlign w:val="baseline"/>
+        </w:rPr>
+      </w:pPr>
+      <w:r>
+        <w:rPr>
+          <w:rFonts w:eastAsia="Arial" w:cs="Arial"/>
+          <w:b w:val="false"/>
+          <w:bCs w:val="false"/>
+          <w:i w:val="false"/>
+          <w:iCs w:val="false"/>
+          <w:caps w:val="false"/>
+          <w:smallCaps w:val="false"/>
+          <w:strike w:val="false"/>
+          <w:dstrike w:val="false"/>
+          <w:color w:val="000000"/>
+          <w:position w:val="0"/>
           <w:sz w:val="20"/>
           <w:szCs w:val="20"/>
           <w:u w:val="none"/>
@@ -952,7 +916,6 @@
           <w:dstrike w:val="false"/>
           <w:color w:val="000000"/>
           <w:position w:val="0"/>
-          <w:sz w:val="20"/>
           <w:sz w:val="20"/>
           <w:szCs w:val="20"/>
           <w:u w:val="none"/>
@@ -980,7 +943,6 @@
               <w:dstrike w:val="false"/>
               <w:color w:val="000000"/>
               <w:position w:val="0"/>
-              <w:sz w:val="20"/>
               <w:sz w:val="20"/>
               <w:szCs w:val="20"/>
               <w:u w:val="none"/>
@@ -1002,7 +964,6 @@
               <w:color w:val="000000"/>
               <w:position w:val="0"/>
               <w:sz w:val="20"/>
-              <w:sz w:val="20"/>
               <w:szCs w:val="20"/>
               <w:u w:val="none"/>
               <w:shd w:fill="auto" w:val="clear"/>
@@ -1025,7 +986,6 @@
           <w:color w:val="000000"/>
           <w:position w:val="0"/>
           <w:sz w:val="20"/>
-          <w:sz w:val="20"/>
           <w:szCs w:val="20"/>
           <w:u w:val="none"/>
           <w:shd w:fill="auto" w:val="clear"/>
@@ -1047,7 +1007,6 @@
           <w:color w:val="000000"/>
           <w:position w:val="0"/>
           <w:sz w:val="20"/>
-          <w:sz w:val="20"/>
           <w:szCs w:val="20"/>
           <w:u w:val="none"/>
           <w:shd w:fill="auto" w:val="clear"/>
@@ -1069,50 +1028,26 @@
           <w:color w:val="000000"/>
           <w:position w:val="0"/>
           <w:sz w:val="20"/>
-          <w:sz w:val="20"/>
-          <w:szCs w:val="20"/>
-          <w:u w:val="none"/>
-          <w:shd w:fill="auto" w:val="clear"/>
-          <w:vertAlign w:val="baseline"/>
-        </w:rPr>
-        <w:t xml:space="preserve">por  un monto capital  de </w:t>
-      </w:r>
-      <w:r>
-        <w:rPr>
-          <w:rFonts w:eastAsia="Arial" w:cs="Arial"/>
-          <w:b w:val="false"/>
-          <w:bCs w:val="false"/>
-          <w:i w:val="false"/>
-          <w:iCs w:val="false"/>
-          <w:caps w:val="false"/>
-          <w:smallCaps w:val="false"/>
-          <w:strike w:val="false"/>
-          <w:dstrike w:val="false"/>
-          <w:color w:val="000000"/>
-          <w:position w:val="0"/>
-          <w:sz w:val="20"/>
-          <w:sz w:val="20"/>
-          <w:szCs w:val="20"/>
-          <w:u w:val="none"/>
-          <w:shd w:fill="auto" w:val="clear"/>
-          <w:vertAlign w:val="baseline"/>
-        </w:rPr>
-        <w:t>{cantidadCapitalCredito}</w:t>
-      </w:r>
-      <w:r>
-        <w:rPr>
-          <w:rFonts w:eastAsia="Arial" w:cs="Arial"/>
-          <w:b/>
-          <w:bCs/>
-          <w:i w:val="false"/>
-          <w:iCs w:val="false"/>
-          <w:caps w:val="false"/>
-          <w:smallCaps w:val="false"/>
-          <w:strike w:val="false"/>
-          <w:dstrike w:val="false"/>
-          <w:color w:val="000000"/>
-          <w:position w:val="0"/>
-          <w:sz w:val="20"/>
+          <w:szCs w:val="20"/>
+          <w:u w:val="none"/>
+          <w:shd w:fill="auto" w:val="clear"/>
+          <w:vertAlign w:val="baseline"/>
+        </w:rPr>
+        <w:t>por  un monto capital  de {cantidadCapitalCredito}</w:t>
+      </w:r>
+      <w:r>
+        <w:rPr>
+          <w:rFonts w:eastAsia="Arial" w:cs="Arial"/>
+          <w:b/>
+          <w:bCs/>
+          <w:i w:val="false"/>
+          <w:iCs w:val="false"/>
+          <w:caps w:val="false"/>
+          <w:smallCaps w:val="false"/>
+          <w:strike w:val="false"/>
+          <w:dstrike w:val="false"/>
+          <w:color w:val="000000"/>
+          <w:position w:val="0"/>
           <w:sz w:val="20"/>
           <w:szCs w:val="20"/>
           <w:u w:val="none"/>
@@ -1134,7 +1069,6 @@
           <w:dstrike w:val="false"/>
           <w:color w:val="000000"/>
           <w:position w:val="0"/>
-          <w:sz w:val="20"/>
           <w:sz w:val="20"/>
           <w:szCs w:val="20"/>
           <w:u w:val="none"/>
@@ -1162,7 +1096,6 @@
               <w:dstrike w:val="false"/>
               <w:color w:val="000000"/>
               <w:position w:val="0"/>
-              <w:sz w:val="20"/>
               <w:sz w:val="20"/>
               <w:szCs w:val="20"/>
               <w:u w:val="none"/>
@@ -1184,7 +1117,6 @@
               <w:color w:val="000000"/>
               <w:position w:val="0"/>
               <w:sz w:val="20"/>
-              <w:sz w:val="20"/>
               <w:szCs w:val="20"/>
               <w:u w:val="none"/>
               <w:shd w:fill="auto" w:val="clear"/>
@@ -1207,7 +1139,6 @@
           <w:color w:val="000000"/>
           <w:position w:val="0"/>
           <w:sz w:val="20"/>
-          <w:sz w:val="20"/>
           <w:szCs w:val="20"/>
           <w:u w:val="none"/>
           <w:shd w:fill="auto" w:val="clear"/>
@@ -1228,7 +1159,6 @@
           <w:dstrike w:val="false"/>
           <w:color w:val="000000"/>
           <w:position w:val="0"/>
-          <w:sz w:val="20"/>
           <w:sz w:val="20"/>
           <w:szCs w:val="20"/>
           <w:u w:val="none"/>
@@ -1256,7 +1186,6 @@
               <w:dstrike w:val="false"/>
               <w:color w:val="000000"/>
               <w:position w:val="0"/>
-              <w:sz w:val="20"/>
               <w:sz w:val="20"/>
               <w:szCs w:val="20"/>
               <w:u w:val="none"/>
@@ -1278,7 +1207,6 @@
               <w:color w:val="000000"/>
               <w:position w:val="0"/>
               <w:sz w:val="20"/>
-              <w:sz w:val="20"/>
               <w:szCs w:val="20"/>
               <w:u w:val="none"/>
               <w:shd w:fill="auto" w:val="clear"/>
@@ -1301,7 +1229,6 @@
           <w:color w:val="000000"/>
           <w:position w:val="0"/>
           <w:sz w:val="20"/>
-          <w:sz w:val="20"/>
           <w:szCs w:val="20"/>
           <w:u w:val="none"/>
           <w:shd w:fill="auto" w:val="clear"/>
@@ -1322,7 +1249,6 @@
           <w:dstrike w:val="false"/>
           <w:color w:val="000000"/>
           <w:position w:val="0"/>
-          <w:sz w:val="20"/>
           <w:sz w:val="20"/>
           <w:szCs w:val="20"/>
           <w:u w:val="none"/>
@@ -1352,36 +1278,33 @@
           <w:b w:val="false"/>
           <w:bCs w:val="false"/>
           <w:i w:val="false"/>
-          <w:i w:val="false"/>
-          <w:iCs w:val="false"/>
-          <w:caps w:val="false"/>
-          <w:smallCaps w:val="false"/>
-          <w:strike w:val="false"/>
-          <w:dstrike w:val="false"/>
-          <w:color w:val="000000"/>
-          <w:position w:val="0"/>
-          <w:sz w:val="20"/>
-          <w:sz w:val="20"/>
-          <w:szCs w:val="20"/>
-          <w:u w:val="none"/>
-          <w:shd w:fill="auto" w:val="clear"/>
-          <w:vertAlign w:val="baseline"/>
-        </w:rPr>
-      </w:pPr>
-      <w:r>
-        <w:rPr>
-          <w:rFonts w:eastAsia="Arial" w:cs="Arial"/>
-          <w:b w:val="false"/>
-          <w:bCs w:val="false"/>
-          <w:i w:val="false"/>
-          <w:iCs w:val="false"/>
-          <w:caps w:val="false"/>
-          <w:smallCaps w:val="false"/>
-          <w:strike w:val="false"/>
-          <w:dstrike w:val="false"/>
-          <w:color w:val="000000"/>
-          <w:position w:val="0"/>
-          <w:sz w:val="20"/>
+          <w:iCs w:val="false"/>
+          <w:caps w:val="false"/>
+          <w:smallCaps w:val="false"/>
+          <w:strike w:val="false"/>
+          <w:dstrike w:val="false"/>
+          <w:color w:val="000000"/>
+          <w:position w:val="0"/>
+          <w:sz w:val="20"/>
+          <w:szCs w:val="20"/>
+          <w:u w:val="none"/>
+          <w:shd w:fill="auto" w:val="clear"/>
+          <w:vertAlign w:val="baseline"/>
+        </w:rPr>
+      </w:pPr>
+      <w:r>
+        <w:rPr>
+          <w:rFonts w:eastAsia="Arial" w:cs="Arial"/>
+          <w:b w:val="false"/>
+          <w:bCs w:val="false"/>
+          <w:i w:val="false"/>
+          <w:iCs w:val="false"/>
+          <w:caps w:val="false"/>
+          <w:smallCaps w:val="false"/>
+          <w:strike w:val="false"/>
+          <w:dstrike w:val="false"/>
+          <w:color w:val="000000"/>
+          <w:position w:val="0"/>
           <w:sz w:val="20"/>
           <w:szCs w:val="20"/>
           <w:u w:val="none"/>
@@ -1410,36 +1333,33 @@
           <w:b w:val="false"/>
           <w:bCs w:val="false"/>
           <w:i w:val="false"/>
-          <w:i w:val="false"/>
-          <w:iCs w:val="false"/>
-          <w:caps w:val="false"/>
-          <w:smallCaps w:val="false"/>
-          <w:strike w:val="false"/>
-          <w:dstrike w:val="false"/>
-          <w:color w:val="000000"/>
-          <w:position w:val="0"/>
-          <w:sz w:val="20"/>
-          <w:sz w:val="20"/>
-          <w:szCs w:val="20"/>
-          <w:u w:val="none"/>
-          <w:shd w:fill="auto" w:val="clear"/>
-          <w:vertAlign w:val="baseline"/>
-        </w:rPr>
-      </w:pPr>
-      <w:r>
-        <w:rPr>
-          <w:rFonts w:eastAsia="Arial" w:cs="Arial"/>
-          <w:b w:val="false"/>
-          <w:bCs w:val="false"/>
-          <w:i w:val="false"/>
-          <w:iCs w:val="false"/>
-          <w:caps w:val="false"/>
-          <w:smallCaps w:val="false"/>
-          <w:strike w:val="false"/>
-          <w:dstrike w:val="false"/>
-          <w:color w:val="000000"/>
-          <w:position w:val="0"/>
-          <w:sz w:val="20"/>
+          <w:iCs w:val="false"/>
+          <w:caps w:val="false"/>
+          <w:smallCaps w:val="false"/>
+          <w:strike w:val="false"/>
+          <w:dstrike w:val="false"/>
+          <w:color w:val="000000"/>
+          <w:position w:val="0"/>
+          <w:sz w:val="20"/>
+          <w:szCs w:val="20"/>
+          <w:u w:val="none"/>
+          <w:shd w:fill="auto" w:val="clear"/>
+          <w:vertAlign w:val="baseline"/>
+        </w:rPr>
+      </w:pPr>
+      <w:r>
+        <w:rPr>
+          <w:rFonts w:eastAsia="Arial" w:cs="Arial"/>
+          <w:b w:val="false"/>
+          <w:bCs w:val="false"/>
+          <w:i w:val="false"/>
+          <w:iCs w:val="false"/>
+          <w:caps w:val="false"/>
+          <w:smallCaps w:val="false"/>
+          <w:strike w:val="false"/>
+          <w:dstrike w:val="false"/>
+          <w:color w:val="000000"/>
+          <w:position w:val="0"/>
           <w:sz w:val="20"/>
           <w:szCs w:val="20"/>
           <w:u w:val="none"/>
@@ -1465,36 +1385,33 @@
           <w:b w:val="false"/>
           <w:bCs w:val="false"/>
           <w:i w:val="false"/>
-          <w:i w:val="false"/>
-          <w:iCs w:val="false"/>
-          <w:caps w:val="false"/>
-          <w:smallCaps w:val="false"/>
-          <w:strike w:val="false"/>
-          <w:dstrike w:val="false"/>
-          <w:color w:val="000000"/>
-          <w:position w:val="0"/>
-          <w:sz w:val="20"/>
-          <w:sz w:val="20"/>
-          <w:szCs w:val="20"/>
-          <w:u w:val="none"/>
-          <w:shd w:fill="auto" w:val="clear"/>
-          <w:vertAlign w:val="baseline"/>
-        </w:rPr>
-      </w:pPr>
-      <w:r>
-        <w:rPr>
-          <w:rFonts w:eastAsia="Arial" w:cs="Arial"/>
-          <w:b w:val="false"/>
-          <w:bCs w:val="false"/>
-          <w:i w:val="false"/>
-          <w:iCs w:val="false"/>
-          <w:caps w:val="false"/>
-          <w:smallCaps w:val="false"/>
-          <w:strike w:val="false"/>
-          <w:dstrike w:val="false"/>
-          <w:color w:val="000000"/>
-          <w:position w:val="0"/>
-          <w:sz w:val="20"/>
+          <w:iCs w:val="false"/>
+          <w:caps w:val="false"/>
+          <w:smallCaps w:val="false"/>
+          <w:strike w:val="false"/>
+          <w:dstrike w:val="false"/>
+          <w:color w:val="000000"/>
+          <w:position w:val="0"/>
+          <w:sz w:val="20"/>
+          <w:szCs w:val="20"/>
+          <w:u w:val="none"/>
+          <w:shd w:fill="auto" w:val="clear"/>
+          <w:vertAlign w:val="baseline"/>
+        </w:rPr>
+      </w:pPr>
+      <w:r>
+        <w:rPr>
+          <w:rFonts w:eastAsia="Arial" w:cs="Arial"/>
+          <w:b w:val="false"/>
+          <w:bCs w:val="false"/>
+          <w:i w:val="false"/>
+          <w:iCs w:val="false"/>
+          <w:caps w:val="false"/>
+          <w:smallCaps w:val="false"/>
+          <w:strike w:val="false"/>
+          <w:dstrike w:val="false"/>
+          <w:color w:val="000000"/>
+          <w:position w:val="0"/>
           <w:sz w:val="20"/>
           <w:szCs w:val="20"/>
           <w:u w:val="none"/>
@@ -1564,36 +1481,33 @@
           <w:b w:val="false"/>
           <w:bCs w:val="false"/>
           <w:i w:val="false"/>
-          <w:i w:val="false"/>
-          <w:iCs w:val="false"/>
-          <w:caps w:val="false"/>
-          <w:smallCaps w:val="false"/>
-          <w:strike w:val="false"/>
-          <w:dstrike w:val="false"/>
-          <w:color w:val="000000"/>
-          <w:position w:val="0"/>
-          <w:sz w:val="20"/>
-          <w:sz w:val="20"/>
-          <w:szCs w:val="20"/>
-          <w:u w:val="none"/>
-          <w:shd w:fill="auto" w:val="clear"/>
-          <w:vertAlign w:val="baseline"/>
-        </w:rPr>
-      </w:pPr>
-      <w:r>
-        <w:rPr>
-          <w:rFonts w:eastAsia="Arial" w:cs="Arial"/>
-          <w:b w:val="false"/>
-          <w:bCs w:val="false"/>
-          <w:i w:val="false"/>
-          <w:iCs w:val="false"/>
-          <w:caps w:val="false"/>
-          <w:smallCaps w:val="false"/>
-          <w:strike w:val="false"/>
-          <w:dstrike w:val="false"/>
-          <w:color w:val="000000"/>
-          <w:position w:val="0"/>
-          <w:sz w:val="20"/>
+          <w:iCs w:val="false"/>
+          <w:caps w:val="false"/>
+          <w:smallCaps w:val="false"/>
+          <w:strike w:val="false"/>
+          <w:dstrike w:val="false"/>
+          <w:color w:val="000000"/>
+          <w:position w:val="0"/>
+          <w:sz w:val="20"/>
+          <w:szCs w:val="20"/>
+          <w:u w:val="none"/>
+          <w:shd w:fill="auto" w:val="clear"/>
+          <w:vertAlign w:val="baseline"/>
+        </w:rPr>
+      </w:pPr>
+      <w:r>
+        <w:rPr>
+          <w:rFonts w:eastAsia="Arial" w:cs="Arial"/>
+          <w:b w:val="false"/>
+          <w:bCs w:val="false"/>
+          <w:i w:val="false"/>
+          <w:iCs w:val="false"/>
+          <w:caps w:val="false"/>
+          <w:smallCaps w:val="false"/>
+          <w:strike w:val="false"/>
+          <w:dstrike w:val="false"/>
+          <w:color w:val="000000"/>
+          <w:position w:val="0"/>
           <w:sz w:val="20"/>
           <w:szCs w:val="20"/>
           <w:u w:val="none"/>
@@ -1619,36 +1533,33 @@
           <w:b w:val="false"/>
           <w:bCs w:val="false"/>
           <w:i w:val="false"/>
-          <w:i w:val="false"/>
-          <w:iCs w:val="false"/>
-          <w:caps w:val="false"/>
-          <w:smallCaps w:val="false"/>
-          <w:strike w:val="false"/>
-          <w:dstrike w:val="false"/>
-          <w:color w:val="000000"/>
-          <w:position w:val="0"/>
-          <w:sz w:val="20"/>
-          <w:sz w:val="20"/>
-          <w:szCs w:val="20"/>
-          <w:u w:val="none"/>
-          <w:shd w:fill="auto" w:val="clear"/>
-          <w:vertAlign w:val="baseline"/>
-        </w:rPr>
-      </w:pPr>
-      <w:r>
-        <w:rPr>
-          <w:rFonts w:eastAsia="Arial" w:cs="Arial"/>
-          <w:b w:val="false"/>
-          <w:bCs w:val="false"/>
-          <w:i w:val="false"/>
-          <w:iCs w:val="false"/>
-          <w:caps w:val="false"/>
-          <w:smallCaps w:val="false"/>
-          <w:strike w:val="false"/>
-          <w:dstrike w:val="false"/>
-          <w:color w:val="000000"/>
-          <w:position w:val="0"/>
-          <w:sz w:val="20"/>
+          <w:iCs w:val="false"/>
+          <w:caps w:val="false"/>
+          <w:smallCaps w:val="false"/>
+          <w:strike w:val="false"/>
+          <w:dstrike w:val="false"/>
+          <w:color w:val="000000"/>
+          <w:position w:val="0"/>
+          <w:sz w:val="20"/>
+          <w:szCs w:val="20"/>
+          <w:u w:val="none"/>
+          <w:shd w:fill="auto" w:val="clear"/>
+          <w:vertAlign w:val="baseline"/>
+        </w:rPr>
+      </w:pPr>
+      <w:r>
+        <w:rPr>
+          <w:rFonts w:eastAsia="Arial" w:cs="Arial"/>
+          <w:b w:val="false"/>
+          <w:bCs w:val="false"/>
+          <w:i w:val="false"/>
+          <w:iCs w:val="false"/>
+          <w:caps w:val="false"/>
+          <w:smallCaps w:val="false"/>
+          <w:strike w:val="false"/>
+          <w:dstrike w:val="false"/>
+          <w:color w:val="000000"/>
+          <w:position w:val="0"/>
           <w:sz w:val="20"/>
           <w:szCs w:val="20"/>
           <w:u w:val="none"/>
@@ -1710,36 +1621,33 @@
           <w:b w:val="false"/>
           <w:bCs w:val="false"/>
           <w:i w:val="false"/>
-          <w:i w:val="false"/>
-          <w:iCs w:val="false"/>
-          <w:caps w:val="false"/>
-          <w:smallCaps w:val="false"/>
-          <w:strike w:val="false"/>
-          <w:dstrike w:val="false"/>
-          <w:color w:val="000000"/>
-          <w:position w:val="0"/>
-          <w:sz w:val="20"/>
-          <w:sz w:val="20"/>
-          <w:szCs w:val="20"/>
-          <w:u w:val="none"/>
-          <w:shd w:fill="auto" w:val="clear"/>
-          <w:vertAlign w:val="baseline"/>
-        </w:rPr>
-      </w:pPr>
-      <w:r>
-        <w:rPr>
-          <w:rFonts w:eastAsia="Arial" w:cs="Arial"/>
-          <w:b w:val="false"/>
-          <w:bCs w:val="false"/>
-          <w:i w:val="false"/>
-          <w:iCs w:val="false"/>
-          <w:caps w:val="false"/>
-          <w:smallCaps w:val="false"/>
-          <w:strike w:val="false"/>
-          <w:dstrike w:val="false"/>
-          <w:color w:val="000000"/>
-          <w:position w:val="0"/>
-          <w:sz w:val="20"/>
+          <w:iCs w:val="false"/>
+          <w:caps w:val="false"/>
+          <w:smallCaps w:val="false"/>
+          <w:strike w:val="false"/>
+          <w:dstrike w:val="false"/>
+          <w:color w:val="000000"/>
+          <w:position w:val="0"/>
+          <w:sz w:val="20"/>
+          <w:szCs w:val="20"/>
+          <w:u w:val="none"/>
+          <w:shd w:fill="auto" w:val="clear"/>
+          <w:vertAlign w:val="baseline"/>
+        </w:rPr>
+      </w:pPr>
+      <w:r>
+        <w:rPr>
+          <w:rFonts w:eastAsia="Arial" w:cs="Arial"/>
+          <w:b w:val="false"/>
+          <w:bCs w:val="false"/>
+          <w:i w:val="false"/>
+          <w:iCs w:val="false"/>
+          <w:caps w:val="false"/>
+          <w:smallCaps w:val="false"/>
+          <w:strike w:val="false"/>
+          <w:dstrike w:val="false"/>
+          <w:color w:val="000000"/>
+          <w:position w:val="0"/>
           <w:sz w:val="20"/>
           <w:szCs w:val="20"/>
           <w:u w:val="none"/>
@@ -1781,36 +1689,33 @@
           <w:b w:val="false"/>
           <w:bCs w:val="false"/>
           <w:i w:val="false"/>
-          <w:i w:val="false"/>
-          <w:iCs w:val="false"/>
-          <w:caps w:val="false"/>
-          <w:smallCaps w:val="false"/>
-          <w:strike w:val="false"/>
-          <w:dstrike w:val="false"/>
-          <w:color w:val="000000"/>
-          <w:position w:val="0"/>
-          <w:sz w:val="20"/>
-          <w:sz w:val="20"/>
-          <w:szCs w:val="20"/>
-          <w:u w:val="none"/>
-          <w:shd w:fill="auto" w:val="clear"/>
-          <w:vertAlign w:val="baseline"/>
-        </w:rPr>
-      </w:pPr>
-      <w:r>
-        <w:rPr>
-          <w:rFonts w:eastAsia="Arial" w:cs="Arial"/>
-          <w:b w:val="false"/>
-          <w:bCs w:val="false"/>
-          <w:i w:val="false"/>
-          <w:iCs w:val="false"/>
-          <w:caps w:val="false"/>
-          <w:smallCaps w:val="false"/>
-          <w:strike w:val="false"/>
-          <w:dstrike w:val="false"/>
-          <w:color w:val="000000"/>
-          <w:position w:val="0"/>
-          <w:sz w:val="20"/>
+          <w:iCs w:val="false"/>
+          <w:caps w:val="false"/>
+          <w:smallCaps w:val="false"/>
+          <w:strike w:val="false"/>
+          <w:dstrike w:val="false"/>
+          <w:color w:val="000000"/>
+          <w:position w:val="0"/>
+          <w:sz w:val="20"/>
+          <w:szCs w:val="20"/>
+          <w:u w:val="none"/>
+          <w:shd w:fill="auto" w:val="clear"/>
+          <w:vertAlign w:val="baseline"/>
+        </w:rPr>
+      </w:pPr>
+      <w:r>
+        <w:rPr>
+          <w:rFonts w:eastAsia="Arial" w:cs="Arial"/>
+          <w:b w:val="false"/>
+          <w:bCs w:val="false"/>
+          <w:i w:val="false"/>
+          <w:iCs w:val="false"/>
+          <w:caps w:val="false"/>
+          <w:smallCaps w:val="false"/>
+          <w:strike w:val="false"/>
+          <w:dstrike w:val="false"/>
+          <w:color w:val="000000"/>
+          <w:position w:val="0"/>
           <w:sz w:val="20"/>
           <w:szCs w:val="20"/>
           <w:u w:val="none"/>
@@ -1833,7 +1738,6 @@
           <w:color w:val="000000"/>
           <w:position w:val="0"/>
           <w:sz w:val="20"/>
-          <w:sz w:val="20"/>
           <w:szCs w:val="20"/>
           <w:u w:val="none"/>
           <w:shd w:fill="auto" w:val="clear"/>
@@ -1854,7 +1758,6 @@
           <w:dstrike w:val="false"/>
           <w:color w:val="000000"/>
           <w:position w:val="0"/>
-          <w:sz w:val="20"/>
           <w:sz w:val="20"/>
           <w:szCs w:val="20"/>
           <w:u w:val="none"/>
@@ -1892,36 +1795,33 @@
           <w:b w:val="false"/>
           <w:bCs w:val="false"/>
           <w:i w:val="false"/>
-          <w:i w:val="false"/>
-          <w:iCs w:val="false"/>
-          <w:caps w:val="false"/>
-          <w:smallCaps w:val="false"/>
-          <w:strike w:val="false"/>
-          <w:dstrike w:val="false"/>
-          <w:color w:val="000000"/>
-          <w:position w:val="0"/>
-          <w:sz w:val="20"/>
-          <w:sz w:val="20"/>
-          <w:szCs w:val="20"/>
-          <w:u w:val="none"/>
-          <w:shd w:fill="auto" w:val="clear"/>
-          <w:vertAlign w:val="baseline"/>
-        </w:rPr>
-      </w:pPr>
-      <w:r>
-        <w:rPr>
-          <w:rFonts w:eastAsia="Arial" w:cs="Arial"/>
-          <w:b w:val="false"/>
-          <w:bCs w:val="false"/>
-          <w:i w:val="false"/>
-          <w:iCs w:val="false"/>
-          <w:caps w:val="false"/>
-          <w:smallCaps w:val="false"/>
-          <w:strike w:val="false"/>
-          <w:dstrike w:val="false"/>
-          <w:color w:val="000000"/>
-          <w:position w:val="0"/>
-          <w:sz w:val="20"/>
+          <w:iCs w:val="false"/>
+          <w:caps w:val="false"/>
+          <w:smallCaps w:val="false"/>
+          <w:strike w:val="false"/>
+          <w:dstrike w:val="false"/>
+          <w:color w:val="000000"/>
+          <w:position w:val="0"/>
+          <w:sz w:val="20"/>
+          <w:szCs w:val="20"/>
+          <w:u w:val="none"/>
+          <w:shd w:fill="auto" w:val="clear"/>
+          <w:vertAlign w:val="baseline"/>
+        </w:rPr>
+      </w:pPr>
+      <w:r>
+        <w:rPr>
+          <w:rFonts w:eastAsia="Arial" w:cs="Arial"/>
+          <w:b w:val="false"/>
+          <w:bCs w:val="false"/>
+          <w:i w:val="false"/>
+          <w:iCs w:val="false"/>
+          <w:caps w:val="false"/>
+          <w:smallCaps w:val="false"/>
+          <w:strike w:val="false"/>
+          <w:dstrike w:val="false"/>
+          <w:color w:val="000000"/>
+          <w:position w:val="0"/>
           <w:sz w:val="20"/>
           <w:szCs w:val="20"/>
           <w:u w:val="none"/>
@@ -1947,36 +1847,33 @@
           <w:b/>
           <w:bCs/>
           <w:i w:val="false"/>
-          <w:i w:val="false"/>
-          <w:iCs w:val="false"/>
-          <w:caps w:val="false"/>
-          <w:smallCaps w:val="false"/>
-          <w:strike w:val="false"/>
-          <w:dstrike w:val="false"/>
-          <w:color w:val="000000"/>
-          <w:position w:val="0"/>
-          <w:sz w:val="20"/>
-          <w:sz w:val="20"/>
-          <w:szCs w:val="20"/>
-          <w:u w:val="none"/>
-          <w:shd w:fill="auto" w:val="clear"/>
-          <w:vertAlign w:val="baseline"/>
-        </w:rPr>
-      </w:pPr>
-      <w:r>
-        <w:rPr>
-          <w:rFonts w:eastAsia="Arial" w:cs="Arial"/>
-          <w:b/>
-          <w:bCs/>
-          <w:i w:val="false"/>
-          <w:iCs w:val="false"/>
-          <w:caps w:val="false"/>
-          <w:smallCaps w:val="false"/>
-          <w:strike w:val="false"/>
-          <w:dstrike w:val="false"/>
-          <w:color w:val="000000"/>
-          <w:position w:val="0"/>
-          <w:sz w:val="20"/>
+          <w:iCs w:val="false"/>
+          <w:caps w:val="false"/>
+          <w:smallCaps w:val="false"/>
+          <w:strike w:val="false"/>
+          <w:dstrike w:val="false"/>
+          <w:color w:val="000000"/>
+          <w:position w:val="0"/>
+          <w:sz w:val="20"/>
+          <w:szCs w:val="20"/>
+          <w:u w:val="none"/>
+          <w:shd w:fill="auto" w:val="clear"/>
+          <w:vertAlign w:val="baseline"/>
+        </w:rPr>
+      </w:pPr>
+      <w:r>
+        <w:rPr>
+          <w:rFonts w:eastAsia="Arial" w:cs="Arial"/>
+          <w:b/>
+          <w:bCs/>
+          <w:i w:val="false"/>
+          <w:iCs w:val="false"/>
+          <w:caps w:val="false"/>
+          <w:smallCaps w:val="false"/>
+          <w:strike w:val="false"/>
+          <w:dstrike w:val="false"/>
+          <w:color w:val="000000"/>
+          <w:position w:val="0"/>
           <w:sz w:val="20"/>
           <w:szCs w:val="20"/>
           <w:u w:val="none"/>
@@ -2002,36 +1899,33 @@
           <w:b w:val="false"/>
           <w:bCs w:val="false"/>
           <w:i w:val="false"/>
-          <w:i w:val="false"/>
-          <w:iCs w:val="false"/>
-          <w:caps w:val="false"/>
-          <w:smallCaps w:val="false"/>
-          <w:strike w:val="false"/>
-          <w:dstrike w:val="false"/>
-          <w:color w:val="000000"/>
-          <w:position w:val="0"/>
-          <w:sz w:val="20"/>
-          <w:sz w:val="20"/>
-          <w:szCs w:val="20"/>
-          <w:u w:val="none"/>
-          <w:shd w:fill="auto" w:val="clear"/>
-          <w:vertAlign w:val="baseline"/>
-        </w:rPr>
-      </w:pPr>
-      <w:r>
-        <w:rPr>
-          <w:rFonts w:eastAsia="Arial" w:cs="Arial"/>
-          <w:b w:val="false"/>
-          <w:bCs w:val="false"/>
-          <w:i w:val="false"/>
-          <w:iCs w:val="false"/>
-          <w:caps w:val="false"/>
-          <w:smallCaps w:val="false"/>
-          <w:strike w:val="false"/>
-          <w:dstrike w:val="false"/>
-          <w:color w:val="000000"/>
-          <w:position w:val="0"/>
-          <w:sz w:val="20"/>
+          <w:iCs w:val="false"/>
+          <w:caps w:val="false"/>
+          <w:smallCaps w:val="false"/>
+          <w:strike w:val="false"/>
+          <w:dstrike w:val="false"/>
+          <w:color w:val="000000"/>
+          <w:position w:val="0"/>
+          <w:sz w:val="20"/>
+          <w:szCs w:val="20"/>
+          <w:u w:val="none"/>
+          <w:shd w:fill="auto" w:val="clear"/>
+          <w:vertAlign w:val="baseline"/>
+        </w:rPr>
+      </w:pPr>
+      <w:r>
+        <w:rPr>
+          <w:rFonts w:eastAsia="Arial" w:cs="Arial"/>
+          <w:b w:val="false"/>
+          <w:bCs w:val="false"/>
+          <w:i w:val="false"/>
+          <w:iCs w:val="false"/>
+          <w:caps w:val="false"/>
+          <w:smallCaps w:val="false"/>
+          <w:strike w:val="false"/>
+          <w:dstrike w:val="false"/>
+          <w:color w:val="000000"/>
+          <w:position w:val="0"/>
           <w:sz w:val="20"/>
           <w:szCs w:val="20"/>
           <w:u w:val="none"/>
@@ -2068,36 +1962,33 @@
           <w:b w:val="false"/>
           <w:bCs w:val="false"/>
           <w:i w:val="false"/>
-          <w:i w:val="false"/>
-          <w:iCs w:val="false"/>
-          <w:caps w:val="false"/>
-          <w:smallCaps w:val="false"/>
-          <w:strike w:val="false"/>
-          <w:dstrike w:val="false"/>
-          <w:color w:val="000000"/>
-          <w:position w:val="0"/>
-          <w:sz w:val="20"/>
-          <w:sz w:val="20"/>
-          <w:szCs w:val="20"/>
-          <w:u w:val="none"/>
-          <w:shd w:fill="auto" w:val="clear"/>
-          <w:vertAlign w:val="baseline"/>
-        </w:rPr>
-      </w:pPr>
-      <w:r>
-        <w:rPr>
-          <w:rFonts w:eastAsia="Arial" w:cs="Arial"/>
-          <w:b w:val="false"/>
-          <w:bCs w:val="false"/>
-          <w:i w:val="false"/>
-          <w:iCs w:val="false"/>
-          <w:caps w:val="false"/>
-          <w:smallCaps w:val="false"/>
-          <w:strike w:val="false"/>
-          <w:dstrike w:val="false"/>
-          <w:color w:val="000000"/>
-          <w:position w:val="0"/>
-          <w:sz w:val="20"/>
+          <w:iCs w:val="false"/>
+          <w:caps w:val="false"/>
+          <w:smallCaps w:val="false"/>
+          <w:strike w:val="false"/>
+          <w:dstrike w:val="false"/>
+          <w:color w:val="000000"/>
+          <w:position w:val="0"/>
+          <w:sz w:val="20"/>
+          <w:szCs w:val="20"/>
+          <w:u w:val="none"/>
+          <w:shd w:fill="auto" w:val="clear"/>
+          <w:vertAlign w:val="baseline"/>
+        </w:rPr>
+      </w:pPr>
+      <w:r>
+        <w:rPr>
+          <w:rFonts w:eastAsia="Arial" w:cs="Arial"/>
+          <w:b w:val="false"/>
+          <w:bCs w:val="false"/>
+          <w:i w:val="false"/>
+          <w:iCs w:val="false"/>
+          <w:caps w:val="false"/>
+          <w:smallCaps w:val="false"/>
+          <w:strike w:val="false"/>
+          <w:dstrike w:val="false"/>
+          <w:color w:val="000000"/>
+          <w:position w:val="0"/>
           <w:sz w:val="20"/>
           <w:szCs w:val="20"/>
           <w:u w:val="none"/>
@@ -2135,36 +2026,33 @@
           <w:b w:val="false"/>
           <w:bCs w:val="false"/>
           <w:i w:val="false"/>
-          <w:i w:val="false"/>
-          <w:iCs w:val="false"/>
-          <w:caps w:val="false"/>
-          <w:smallCaps w:val="false"/>
-          <w:strike w:val="false"/>
-          <w:dstrike w:val="false"/>
-          <w:color w:val="000000"/>
-          <w:position w:val="0"/>
-          <w:sz w:val="20"/>
-          <w:sz w:val="20"/>
-          <w:szCs w:val="20"/>
-          <w:u w:val="none"/>
-          <w:shd w:fill="auto" w:val="clear"/>
-          <w:vertAlign w:val="baseline"/>
-        </w:rPr>
-      </w:pPr>
-      <w:r>
-        <w:rPr>
-          <w:rFonts w:eastAsia="Arial" w:cs="Arial"/>
-          <w:b w:val="false"/>
-          <w:bCs w:val="false"/>
-          <w:i w:val="false"/>
-          <w:iCs w:val="false"/>
-          <w:caps w:val="false"/>
-          <w:smallCaps w:val="false"/>
-          <w:strike w:val="false"/>
-          <w:dstrike w:val="false"/>
-          <w:color w:val="000000"/>
-          <w:position w:val="0"/>
-          <w:sz w:val="20"/>
+          <w:iCs w:val="false"/>
+          <w:caps w:val="false"/>
+          <w:smallCaps w:val="false"/>
+          <w:strike w:val="false"/>
+          <w:dstrike w:val="false"/>
+          <w:color w:val="000000"/>
+          <w:position w:val="0"/>
+          <w:sz w:val="20"/>
+          <w:szCs w:val="20"/>
+          <w:u w:val="none"/>
+          <w:shd w:fill="auto" w:val="clear"/>
+          <w:vertAlign w:val="baseline"/>
+        </w:rPr>
+      </w:pPr>
+      <w:r>
+        <w:rPr>
+          <w:rFonts w:eastAsia="Arial" w:cs="Arial"/>
+          <w:b w:val="false"/>
+          <w:bCs w:val="false"/>
+          <w:i w:val="false"/>
+          <w:iCs w:val="false"/>
+          <w:caps w:val="false"/>
+          <w:smallCaps w:val="false"/>
+          <w:strike w:val="false"/>
+          <w:dstrike w:val="false"/>
+          <w:color w:val="000000"/>
+          <w:position w:val="0"/>
           <w:sz w:val="20"/>
           <w:szCs w:val="20"/>
           <w:u w:val="none"/>
@@ -2202,36 +2090,33 @@
           <w:b w:val="false"/>
           <w:bCs w:val="false"/>
           <w:i w:val="false"/>
-          <w:i w:val="false"/>
-          <w:iCs w:val="false"/>
-          <w:caps w:val="false"/>
-          <w:smallCaps w:val="false"/>
-          <w:strike w:val="false"/>
-          <w:dstrike w:val="false"/>
-          <w:color w:val="000000"/>
-          <w:position w:val="0"/>
-          <w:sz w:val="20"/>
-          <w:sz w:val="20"/>
-          <w:szCs w:val="20"/>
-          <w:u w:val="none"/>
-          <w:shd w:fill="auto" w:val="clear"/>
-          <w:vertAlign w:val="baseline"/>
-        </w:rPr>
-      </w:pPr>
-      <w:r>
-        <w:rPr>
-          <w:rFonts w:eastAsia="Arial" w:cs="Arial"/>
-          <w:b w:val="false"/>
-          <w:bCs w:val="false"/>
-          <w:i w:val="false"/>
-          <w:iCs w:val="false"/>
-          <w:caps w:val="false"/>
-          <w:smallCaps w:val="false"/>
-          <w:strike w:val="false"/>
-          <w:dstrike w:val="false"/>
-          <w:color w:val="000000"/>
-          <w:position w:val="0"/>
-          <w:sz w:val="20"/>
+          <w:iCs w:val="false"/>
+          <w:caps w:val="false"/>
+          <w:smallCaps w:val="false"/>
+          <w:strike w:val="false"/>
+          <w:dstrike w:val="false"/>
+          <w:color w:val="000000"/>
+          <w:position w:val="0"/>
+          <w:sz w:val="20"/>
+          <w:szCs w:val="20"/>
+          <w:u w:val="none"/>
+          <w:shd w:fill="auto" w:val="clear"/>
+          <w:vertAlign w:val="baseline"/>
+        </w:rPr>
+      </w:pPr>
+      <w:r>
+        <w:rPr>
+          <w:rFonts w:eastAsia="Arial" w:cs="Arial"/>
+          <w:b w:val="false"/>
+          <w:bCs w:val="false"/>
+          <w:i w:val="false"/>
+          <w:iCs w:val="false"/>
+          <w:caps w:val="false"/>
+          <w:smallCaps w:val="false"/>
+          <w:strike w:val="false"/>
+          <w:dstrike w:val="false"/>
+          <w:color w:val="000000"/>
+          <w:position w:val="0"/>
           <w:sz w:val="20"/>
           <w:szCs w:val="20"/>
           <w:u w:val="none"/>
@@ -2268,36 +2153,33 @@
           <w:b w:val="false"/>
           <w:bCs w:val="false"/>
           <w:i w:val="false"/>
-          <w:i w:val="false"/>
-          <w:iCs w:val="false"/>
-          <w:caps w:val="false"/>
-          <w:smallCaps w:val="false"/>
-          <w:strike w:val="false"/>
-          <w:dstrike w:val="false"/>
-          <w:color w:val="000000"/>
-          <w:position w:val="0"/>
-          <w:sz w:val="20"/>
-          <w:sz w:val="20"/>
-          <w:szCs w:val="20"/>
-          <w:u w:val="none"/>
-          <w:shd w:fill="auto" w:val="clear"/>
-          <w:vertAlign w:val="baseline"/>
-        </w:rPr>
-      </w:pPr>
-      <w:r>
-        <w:rPr>
-          <w:rFonts w:eastAsia="Arial" w:cs="Arial"/>
-          <w:b w:val="false"/>
-          <w:bCs w:val="false"/>
-          <w:i w:val="false"/>
-          <w:iCs w:val="false"/>
-          <w:caps w:val="false"/>
-          <w:smallCaps w:val="false"/>
-          <w:strike w:val="false"/>
-          <w:dstrike w:val="false"/>
-          <w:color w:val="000000"/>
-          <w:position w:val="0"/>
-          <w:sz w:val="20"/>
+          <w:iCs w:val="false"/>
+          <w:caps w:val="false"/>
+          <w:smallCaps w:val="false"/>
+          <w:strike w:val="false"/>
+          <w:dstrike w:val="false"/>
+          <w:color w:val="000000"/>
+          <w:position w:val="0"/>
+          <w:sz w:val="20"/>
+          <w:szCs w:val="20"/>
+          <w:u w:val="none"/>
+          <w:shd w:fill="auto" w:val="clear"/>
+          <w:vertAlign w:val="baseline"/>
+        </w:rPr>
+      </w:pPr>
+      <w:r>
+        <w:rPr>
+          <w:rFonts w:eastAsia="Arial" w:cs="Arial"/>
+          <w:b w:val="false"/>
+          <w:bCs w:val="false"/>
+          <w:i w:val="false"/>
+          <w:iCs w:val="false"/>
+          <w:caps w:val="false"/>
+          <w:smallCaps w:val="false"/>
+          <w:strike w:val="false"/>
+          <w:dstrike w:val="false"/>
+          <w:color w:val="000000"/>
+          <w:position w:val="0"/>
           <w:sz w:val="20"/>
           <w:szCs w:val="20"/>
           <w:u w:val="none"/>
@@ -2339,36 +2221,33 @@
           <w:b w:val="false"/>
           <w:bCs w:val="false"/>
           <w:i w:val="false"/>
-          <w:i w:val="false"/>
-          <w:iCs w:val="false"/>
-          <w:caps w:val="false"/>
-          <w:smallCaps w:val="false"/>
-          <w:strike w:val="false"/>
-          <w:dstrike w:val="false"/>
-          <w:color w:val="000000"/>
-          <w:position w:val="0"/>
-          <w:sz w:val="20"/>
-          <w:sz w:val="20"/>
-          <w:szCs w:val="20"/>
-          <w:u w:val="none"/>
-          <w:shd w:fill="auto" w:val="clear"/>
-          <w:vertAlign w:val="baseline"/>
-        </w:rPr>
-      </w:pPr>
-      <w:r>
-        <w:rPr>
-          <w:rFonts w:eastAsia="Arial" w:cs="Arial"/>
-          <w:b w:val="false"/>
-          <w:bCs w:val="false"/>
-          <w:i w:val="false"/>
-          <w:iCs w:val="false"/>
-          <w:caps w:val="false"/>
-          <w:smallCaps w:val="false"/>
-          <w:strike w:val="false"/>
-          <w:dstrike w:val="false"/>
-          <w:color w:val="000000"/>
-          <w:position w:val="0"/>
-          <w:sz w:val="20"/>
+          <w:iCs w:val="false"/>
+          <w:caps w:val="false"/>
+          <w:smallCaps w:val="false"/>
+          <w:strike w:val="false"/>
+          <w:dstrike w:val="false"/>
+          <w:color w:val="000000"/>
+          <w:position w:val="0"/>
+          <w:sz w:val="20"/>
+          <w:szCs w:val="20"/>
+          <w:u w:val="none"/>
+          <w:shd w:fill="auto" w:val="clear"/>
+          <w:vertAlign w:val="baseline"/>
+        </w:rPr>
+      </w:pPr>
+      <w:r>
+        <w:rPr>
+          <w:rFonts w:eastAsia="Arial" w:cs="Arial"/>
+          <w:b w:val="false"/>
+          <w:bCs w:val="false"/>
+          <w:i w:val="false"/>
+          <w:iCs w:val="false"/>
+          <w:caps w:val="false"/>
+          <w:smallCaps w:val="false"/>
+          <w:strike w:val="false"/>
+          <w:dstrike w:val="false"/>
+          <w:color w:val="000000"/>
+          <w:position w:val="0"/>
           <w:sz w:val="20"/>
           <w:szCs w:val="20"/>
           <w:u w:val="none"/>
@@ -2396,7 +2275,6 @@
               <w:dstrike w:val="false"/>
               <w:color w:val="000000"/>
               <w:position w:val="0"/>
-              <w:sz w:val="20"/>
               <w:sz w:val="20"/>
               <w:szCs w:val="20"/>
               <w:u w:val="none"/>
@@ -2418,7 +2296,6 @@
               <w:color w:val="000000"/>
               <w:position w:val="0"/>
               <w:sz w:val="20"/>
-              <w:sz w:val="20"/>
               <w:szCs w:val="20"/>
               <w:u w:val="none"/>
               <w:shd w:fill="auto" w:val="clear"/>
@@ -2441,7 +2318,6 @@
           <w:color w:val="000000"/>
           <w:position w:val="0"/>
           <w:sz w:val="20"/>
-          <w:sz w:val="20"/>
           <w:szCs w:val="20"/>
           <w:u w:val="none"/>
           <w:shd w:fill="auto" w:val="clear"/>
@@ -2463,7 +2339,6 @@
           <w:color w:val="000000"/>
           <w:position w:val="0"/>
           <w:sz w:val="20"/>
-          <w:sz w:val="20"/>
           <w:szCs w:val="20"/>
           <w:u w:val="single"/>
           <w:shd w:fill="auto" w:val="clear"/>
@@ -2484,7 +2359,6 @@
           <w:dstrike w:val="false"/>
           <w:color w:val="000000"/>
           <w:position w:val="0"/>
-          <w:sz w:val="20"/>
           <w:sz w:val="20"/>
           <w:szCs w:val="20"/>
           <w:u w:val="none"/>
@@ -2510,36 +2384,81 @@
           <w:b w:val="false"/>
           <w:bCs w:val="false"/>
           <w:i w:val="false"/>
-          <w:i w:val="false"/>
-          <w:iCs w:val="false"/>
-          <w:caps w:val="false"/>
-          <w:smallCaps w:val="false"/>
-          <w:strike w:val="false"/>
-          <w:dstrike w:val="false"/>
-          <w:color w:val="000000"/>
-          <w:position w:val="0"/>
-          <w:sz w:val="20"/>
-          <w:sz w:val="20"/>
-          <w:szCs w:val="20"/>
-          <w:u w:val="none"/>
-          <w:shd w:fill="auto" w:val="clear"/>
-          <w:vertAlign w:val="baseline"/>
-        </w:rPr>
-      </w:pPr>
-      <w:r>
-        <w:rPr>
-          <w:rFonts w:eastAsia="Arial" w:cs="Arial"/>
-          <w:b w:val="false"/>
-          <w:bCs w:val="false"/>
-          <w:i w:val="false"/>
-          <w:iCs w:val="false"/>
-          <w:caps w:val="false"/>
-          <w:smallCaps w:val="false"/>
-          <w:strike w:val="false"/>
-          <w:dstrike w:val="false"/>
-          <w:color w:val="000000"/>
-          <w:position w:val="0"/>
-          <w:sz w:val="20"/>
+          <w:iCs w:val="false"/>
+          <w:caps w:val="false"/>
+          <w:smallCaps w:val="false"/>
+          <w:strike w:val="false"/>
+          <w:dstrike w:val="false"/>
+          <w:color w:val="000000"/>
+          <w:position w:val="0"/>
+          <w:sz w:val="20"/>
+          <w:szCs w:val="20"/>
+          <w:u w:val="none"/>
+          <w:shd w:fill="auto" w:val="clear"/>
+          <w:vertAlign w:val="baseline"/>
+        </w:rPr>
+      </w:pPr>
+      <w:r>
+        <w:rPr>
+          <w:rFonts w:eastAsia="Arial" w:cs="Arial"/>
+          <w:b w:val="false"/>
+          <w:bCs w:val="false"/>
+          <w:i w:val="false"/>
+          <w:iCs w:val="false"/>
+          <w:caps w:val="false"/>
+          <w:smallCaps w:val="false"/>
+          <w:strike w:val="false"/>
+          <w:dstrike w:val="false"/>
+          <w:color w:val="000000"/>
+          <w:position w:val="0"/>
+          <w:sz w:val="20"/>
+          <w:szCs w:val="20"/>
+          <w:u w:val="none"/>
+          <w:shd w:fill="auto" w:val="clear"/>
+          <w:vertAlign w:val="baseline"/>
+        </w:rPr>
+      </w:r>
+    </w:p>
+    <w:p>
+      <w:pPr>
+        <w:pStyle w:val="normal1"/>
+        <w:widowControl w:val="false"/>
+        <w:shd w:val="clear" w:fill="auto"/>
+        <w:spacing w:lineRule="auto" w:line="240" w:before="0" w:after="0"/>
+        <w:ind w:hanging="0" w:left="0" w:right="0"/>
+        <w:jc w:val="left"/>
+        <w:rPr>
+          <w:rFonts w:ascii="Arial" w:hAnsi="Arial" w:eastAsia="Arial" w:cs="Arial"/>
+          <w:b w:val="false"/>
+          <w:bCs w:val="false"/>
+          <w:i w:val="false"/>
+          <w:iCs w:val="false"/>
+          <w:caps w:val="false"/>
+          <w:smallCaps w:val="false"/>
+          <w:strike w:val="false"/>
+          <w:dstrike w:val="false"/>
+          <w:color w:val="000000"/>
+          <w:position w:val="0"/>
+          <w:sz w:val="20"/>
+          <w:szCs w:val="20"/>
+          <w:u w:val="none"/>
+          <w:shd w:fill="auto" w:val="clear"/>
+          <w:vertAlign w:val="baseline"/>
+        </w:rPr>
+      </w:pPr>
+      <w:r>
+        <w:rPr>
+          <w:rFonts w:eastAsia="Arial" w:cs="Arial"/>
+          <w:b w:val="false"/>
+          <w:bCs w:val="false"/>
+          <w:i w:val="false"/>
+          <w:iCs w:val="false"/>
+          <w:caps w:val="false"/>
+          <w:smallCaps w:val="false"/>
+          <w:strike w:val="false"/>
+          <w:dstrike w:val="false"/>
+          <w:color w:val="000000"/>
+          <w:position w:val="0"/>
           <w:sz w:val="20"/>
           <w:szCs w:val="20"/>
           <w:u w:val="none"/>
@@ -2564,36 +2483,33 @@
           <w:b w:val="false"/>
           <w:bCs w:val="false"/>
           <w:i w:val="false"/>
-          <w:i w:val="false"/>
-          <w:iCs w:val="false"/>
-          <w:caps w:val="false"/>
-          <w:smallCaps w:val="false"/>
-          <w:strike w:val="false"/>
-          <w:dstrike w:val="false"/>
-          <w:color w:val="000000"/>
-          <w:position w:val="0"/>
-          <w:sz w:val="20"/>
-          <w:sz w:val="20"/>
-          <w:szCs w:val="20"/>
-          <w:u w:val="none"/>
-          <w:shd w:fill="auto" w:val="clear"/>
-          <w:vertAlign w:val="baseline"/>
-        </w:rPr>
-      </w:pPr>
-      <w:r>
-        <w:rPr>
-          <w:rFonts w:eastAsia="Arial" w:cs="Arial"/>
-          <w:b w:val="false"/>
-          <w:bCs w:val="false"/>
-          <w:i w:val="false"/>
-          <w:iCs w:val="false"/>
-          <w:caps w:val="false"/>
-          <w:smallCaps w:val="false"/>
-          <w:strike w:val="false"/>
-          <w:dstrike w:val="false"/>
-          <w:color w:val="000000"/>
-          <w:position w:val="0"/>
-          <w:sz w:val="20"/>
+          <w:iCs w:val="false"/>
+          <w:caps w:val="false"/>
+          <w:smallCaps w:val="false"/>
+          <w:strike w:val="false"/>
+          <w:dstrike w:val="false"/>
+          <w:color w:val="000000"/>
+          <w:position w:val="0"/>
+          <w:sz w:val="20"/>
+          <w:szCs w:val="20"/>
+          <w:u w:val="none"/>
+          <w:shd w:fill="auto" w:val="clear"/>
+          <w:vertAlign w:val="baseline"/>
+        </w:rPr>
+      </w:pPr>
+      <w:r>
+        <w:rPr>
+          <w:rFonts w:eastAsia="Arial" w:cs="Arial"/>
+          <w:b w:val="false"/>
+          <w:bCs w:val="false"/>
+          <w:i w:val="false"/>
+          <w:iCs w:val="false"/>
+          <w:caps w:val="false"/>
+          <w:smallCaps w:val="false"/>
+          <w:strike w:val="false"/>
+          <w:dstrike w:val="false"/>
+          <w:color w:val="000000"/>
+          <w:position w:val="0"/>
           <w:sz w:val="20"/>
           <w:szCs w:val="20"/>
           <w:u w:val="none"/>
@@ -2611,7 +2527,7 @@
       </w:pPr>
       <w:r>
         <w:rPr/>
-        <w:t>POR CUBE INVESTMENTES, S.A.:</w:t>
+        <w:t>POR CUBE INVESTMENTS, S.A.:</w:t>
       </w:r>
     </w:p>
     <w:p>
@@ -2630,36 +2546,33 @@
           <w:b/>
           <w:bCs/>
           <w:i w:val="false"/>
-          <w:i w:val="false"/>
-          <w:iCs w:val="false"/>
-          <w:caps w:val="false"/>
-          <w:smallCaps w:val="false"/>
-          <w:strike w:val="false"/>
-          <w:dstrike w:val="false"/>
-          <w:color w:val="000000"/>
-          <w:position w:val="0"/>
-          <w:sz w:val="20"/>
-          <w:sz w:val="20"/>
-          <w:szCs w:val="20"/>
-          <w:u w:val="none"/>
-          <w:shd w:fill="auto" w:val="clear"/>
-          <w:vertAlign w:val="baseline"/>
-        </w:rPr>
-      </w:pPr>
-      <w:r>
-        <w:rPr>
-          <w:rFonts w:eastAsia="Arial" w:cs="Arial"/>
-          <w:b/>
-          <w:bCs/>
-          <w:i w:val="false"/>
-          <w:iCs w:val="false"/>
-          <w:caps w:val="false"/>
-          <w:smallCaps w:val="false"/>
-          <w:strike w:val="false"/>
-          <w:dstrike w:val="false"/>
-          <w:color w:val="000000"/>
-          <w:position w:val="0"/>
-          <w:sz w:val="20"/>
+          <w:iCs w:val="false"/>
+          <w:caps w:val="false"/>
+          <w:smallCaps w:val="false"/>
+          <w:strike w:val="false"/>
+          <w:dstrike w:val="false"/>
+          <w:color w:val="000000"/>
+          <w:position w:val="0"/>
+          <w:sz w:val="20"/>
+          <w:szCs w:val="20"/>
+          <w:u w:val="none"/>
+          <w:shd w:fill="auto" w:val="clear"/>
+          <w:vertAlign w:val="baseline"/>
+        </w:rPr>
+      </w:pPr>
+      <w:r>
+        <w:rPr>
+          <w:rFonts w:eastAsia="Arial" w:cs="Arial"/>
+          <w:b/>
+          <w:bCs/>
+          <w:i w:val="false"/>
+          <w:iCs w:val="false"/>
+          <w:caps w:val="false"/>
+          <w:smallCaps w:val="false"/>
+          <w:strike w:val="false"/>
+          <w:dstrike w:val="false"/>
+          <w:color w:val="000000"/>
+          <w:position w:val="0"/>
           <w:sz w:val="20"/>
           <w:szCs w:val="20"/>
           <w:u w:val="none"/>
@@ -2684,36 +2597,33 @@
           <w:b/>
           <w:bCs/>
           <w:i w:val="false"/>
-          <w:i w:val="false"/>
-          <w:iCs w:val="false"/>
-          <w:caps w:val="false"/>
-          <w:smallCaps w:val="false"/>
-          <w:strike w:val="false"/>
-          <w:dstrike w:val="false"/>
-          <w:color w:val="000000"/>
-          <w:position w:val="0"/>
-          <w:sz w:val="20"/>
-          <w:sz w:val="20"/>
-          <w:szCs w:val="20"/>
-          <w:u w:val="none"/>
-          <w:shd w:fill="auto" w:val="clear"/>
-          <w:vertAlign w:val="baseline"/>
-        </w:rPr>
-      </w:pPr>
-      <w:r>
-        <w:rPr>
-          <w:rFonts w:eastAsia="Arial" w:cs="Arial"/>
-          <w:b/>
-          <w:bCs/>
-          <w:i w:val="false"/>
-          <w:iCs w:val="false"/>
-          <w:caps w:val="false"/>
-          <w:smallCaps w:val="false"/>
-          <w:strike w:val="false"/>
-          <w:dstrike w:val="false"/>
-          <w:color w:val="000000"/>
-          <w:position w:val="0"/>
-          <w:sz w:val="20"/>
+          <w:iCs w:val="false"/>
+          <w:caps w:val="false"/>
+          <w:smallCaps w:val="false"/>
+          <w:strike w:val="false"/>
+          <w:dstrike w:val="false"/>
+          <w:color w:val="000000"/>
+          <w:position w:val="0"/>
+          <w:sz w:val="20"/>
+          <w:szCs w:val="20"/>
+          <w:u w:val="none"/>
+          <w:shd w:fill="auto" w:val="clear"/>
+          <w:vertAlign w:val="baseline"/>
+        </w:rPr>
+      </w:pPr>
+      <w:r>
+        <w:rPr>
+          <w:rFonts w:eastAsia="Arial" w:cs="Arial"/>
+          <w:b/>
+          <w:bCs/>
+          <w:i w:val="false"/>
+          <w:iCs w:val="false"/>
+          <w:caps w:val="false"/>
+          <w:smallCaps w:val="false"/>
+          <w:strike w:val="false"/>
+          <w:dstrike w:val="false"/>
+          <w:color w:val="000000"/>
+          <w:position w:val="0"/>
           <w:sz w:val="20"/>
           <w:szCs w:val="20"/>
           <w:u w:val="none"/>
@@ -2738,36 +2648,33 @@
           <w:b/>
           <w:bCs/>
           <w:i w:val="false"/>
-          <w:i w:val="false"/>
-          <w:iCs w:val="false"/>
-          <w:caps w:val="false"/>
-          <w:smallCaps w:val="false"/>
-          <w:strike w:val="false"/>
-          <w:dstrike w:val="false"/>
-          <w:color w:val="000000"/>
-          <w:position w:val="0"/>
-          <w:sz w:val="20"/>
-          <w:sz w:val="20"/>
-          <w:szCs w:val="20"/>
-          <w:u w:val="none"/>
-          <w:shd w:fill="auto" w:val="clear"/>
-          <w:vertAlign w:val="baseline"/>
-        </w:rPr>
-      </w:pPr>
-      <w:r>
-        <w:rPr>
-          <w:rFonts w:eastAsia="Arial" w:cs="Arial"/>
-          <w:b/>
-          <w:bCs/>
-          <w:i w:val="false"/>
-          <w:iCs w:val="false"/>
-          <w:caps w:val="false"/>
-          <w:smallCaps w:val="false"/>
-          <w:strike w:val="false"/>
-          <w:dstrike w:val="false"/>
-          <w:color w:val="000000"/>
-          <w:position w:val="0"/>
-          <w:sz w:val="20"/>
+          <w:iCs w:val="false"/>
+          <w:caps w:val="false"/>
+          <w:smallCaps w:val="false"/>
+          <w:strike w:val="false"/>
+          <w:dstrike w:val="false"/>
+          <w:color w:val="000000"/>
+          <w:position w:val="0"/>
+          <w:sz w:val="20"/>
+          <w:szCs w:val="20"/>
+          <w:u w:val="none"/>
+          <w:shd w:fill="auto" w:val="clear"/>
+          <w:vertAlign w:val="baseline"/>
+        </w:rPr>
+      </w:pPr>
+      <w:r>
+        <w:rPr>
+          <w:rFonts w:eastAsia="Arial" w:cs="Arial"/>
+          <w:b/>
+          <w:bCs/>
+          <w:i w:val="false"/>
+          <w:iCs w:val="false"/>
+          <w:caps w:val="false"/>
+          <w:smallCaps w:val="false"/>
+          <w:strike w:val="false"/>
+          <w:dstrike w:val="false"/>
+          <w:color w:val="000000"/>
+          <w:position w:val="0"/>
           <w:sz w:val="20"/>
           <w:szCs w:val="20"/>
           <w:u w:val="none"/>
@@ -2792,42 +2699,50 @@
           <w:b/>
           <w:bCs/>
           <w:i w:val="false"/>
-          <w:i w:val="false"/>
-          <w:iCs w:val="false"/>
-          <w:caps w:val="false"/>
-          <w:smallCaps w:val="false"/>
-          <w:strike w:val="false"/>
-          <w:dstrike w:val="false"/>
-          <w:color w:val="000000"/>
-          <w:position w:val="0"/>
-          <w:sz w:val="20"/>
-          <w:sz w:val="20"/>
-          <w:szCs w:val="20"/>
-          <w:u w:val="none"/>
-          <w:shd w:fill="auto" w:val="clear"/>
-          <w:vertAlign w:val="baseline"/>
-        </w:rPr>
-      </w:pPr>
-      <w:r>
-        <w:rPr>
-          <w:rFonts w:eastAsia="Arial" w:cs="Arial"/>
-          <w:b/>
-          <w:bCs/>
-          <w:i w:val="false"/>
-          <w:iCs w:val="false"/>
-          <w:caps w:val="false"/>
-          <w:smallCaps w:val="false"/>
-          <w:strike w:val="false"/>
-          <w:dstrike w:val="false"/>
-          <w:color w:val="000000"/>
-          <w:position w:val="0"/>
-          <w:sz w:val="20"/>
-          <w:sz w:val="20"/>
-          <w:szCs w:val="20"/>
-          <w:u w:val="none"/>
-          <w:shd w:fill="auto" w:val="clear"/>
-          <w:vertAlign w:val="baseline"/>
-        </w:rPr>
+          <w:iCs w:val="false"/>
+          <w:caps w:val="false"/>
+          <w:smallCaps w:val="false"/>
+          <w:strike w:val="false"/>
+          <w:dstrike w:val="false"/>
+          <w:color w:val="000000"/>
+          <w:position w:val="0"/>
+          <w:sz w:val="20"/>
+          <w:szCs w:val="20"/>
+          <w:u w:val="none"/>
+          <w:shd w:fill="auto" w:val="clear"/>
+          <w:vertAlign w:val="baseline"/>
+        </w:rPr>
+      </w:pPr>
+      <w:r>
+        <w:rPr>
+          <w:rFonts w:eastAsia="Arial" w:cs="Arial"/>
+          <w:b/>
+          <w:bCs/>
+          <w:i w:val="false"/>
+          <w:iCs w:val="false"/>
+          <w:caps w:val="false"/>
+          <w:smallCaps w:val="false"/>
+          <w:strike w:val="false"/>
+          <w:dstrike w:val="false"/>
+          <w:color w:val="000000"/>
+          <w:position w:val="0"/>
+          <w:sz w:val="20"/>
+          <w:szCs w:val="20"/>
+          <w:u w:val="none"/>
+          <w:shd w:fill="auto" w:val="clear"/>
+          <w:vertAlign w:val="baseline"/>
+        </w:rPr>
+      </w:r>
+    </w:p>
+    <w:p>
+      <w:pPr>
+        <w:pStyle w:val="normal1"/>
+        <w:spacing w:lineRule="auto" w:line="240" w:before="194" w:after="0"/>
+        <w:ind w:hanging="0" w:left="0"/>
+        <w:rPr/>
+      </w:pPr>
+      <w:r>
+        <w:rPr/>
       </w:r>
     </w:p>
     <w:p>
@@ -2846,46 +2761,25 @@
           <w:b/>
           <w:bCs/>
           <w:i w:val="false"/>
-          <w:i w:val="false"/>
-          <w:iCs w:val="false"/>
-          <w:caps w:val="false"/>
-          <w:smallCaps w:val="false"/>
-          <w:strike w:val="false"/>
-          <w:dstrike w:val="false"/>
-          <w:color w:val="000000"/>
-          <w:position w:val="0"/>
-          <w:sz w:val="20"/>
-          <w:sz w:val="20"/>
-          <w:szCs w:val="20"/>
-          <w:u w:val="none"/>
-          <w:shd w:fill="auto" w:val="clear"/>
-          <w:vertAlign w:val="baseline"/>
-        </w:rPr>
-      </w:pPr>
-      <w:r>
-        <w:rPr>
-          <w:rFonts w:eastAsia="Arial" w:cs="Arial"/>
-          <w:b/>
-          <w:bCs/>
-          <w:i w:val="false"/>
-          <w:iCs w:val="false"/>
-          <w:caps w:val="false"/>
-          <w:smallCaps w:val="false"/>
-          <w:strike w:val="false"/>
-          <w:dstrike w:val="false"/>
-          <w:color w:val="000000"/>
-          <w:position w:val="0"/>
-          <w:sz w:val="20"/>
-          <w:sz w:val="20"/>
-          <w:szCs w:val="20"/>
-          <w:u w:val="none"/>
-          <w:shd w:fill="auto" w:val="clear"/>
-          <w:vertAlign w:val="baseline"/>
-        </w:rPr>
+          <w:iCs w:val="false"/>
+          <w:caps w:val="false"/>
+          <w:smallCaps w:val="false"/>
+          <w:strike w:val="false"/>
+          <w:dstrike w:val="false"/>
+          <w:color w:val="000000"/>
+          <w:position w:val="0"/>
+          <w:sz w:val="20"/>
+          <w:szCs w:val="20"/>
+          <w:u w:val="none"/>
+          <w:shd w:fill="auto" w:val="clear"/>
+          <w:vertAlign w:val="baseline"/>
+        </w:rPr>
+      </w:pPr>
+      <w:r>
         <mc:AlternateContent>
           <mc:Choice Requires="wps">
             <w:drawing>
-              <wp:anchor behindDoc="0" distT="0" distB="0" distL="0" distR="0" simplePos="0" locked="0" layoutInCell="0" allowOverlap="1" relativeHeight="3">
+              <wp:anchor distT="0" distB="0" distL="0" distR="0" simplePos="0" relativeHeight="3" behindDoc="0" locked="0" layoutInCell="0" allowOverlap="1">
                 <wp:simplePos x="0" y="0"/>
                 <wp:positionH relativeFrom="column">
                   <wp:posOffset>165100</wp:posOffset>
@@ -2910,11 +2804,12 @@
                           <a:avLst/>
                           <a:gdLst>
                             <a:gd name="textAreaLeft" fmla="*/ 0 w 720"/>
-                            <a:gd name="textAreaRight" fmla="*/ 2160 w 720"/>
+                            <a:gd name="textAreaRight" fmla="*/ 3240 w 720"/>
                             <a:gd name="textAreaTop" fmla="*/ 0 h 7200"/>
-                            <a:gd name="textAreaBottom" fmla="*/ 8280 h 7200"/>
+                            <a:gd name="textAreaBottom" fmla="*/ 8640 h 7200"/>
                           </a:gdLst>
                           <a:ahLst/>
+                          <a:cxnLst/>
                           <a:rect l="textAreaLeft" t="textAreaTop" r="textAreaRight" b="textAreaBottom"/>
                           <a:pathLst>
                             <a:path w="2331085" h="120000">
@@ -2953,19 +2848,55 @@
           </mc:Fallback>
         </mc:AlternateContent>
       </w:r>
+      <w:r>
+        <w:rPr>
+          <w:rFonts w:eastAsia="Arial" w:cs="Arial"/>
+          <w:b/>
+          <w:bCs/>
+          <w:i w:val="false"/>
+          <w:iCs w:val="false"/>
+          <w:caps w:val="false"/>
+          <w:smallCaps w:val="false"/>
+          <w:strike w:val="false"/>
+          <w:dstrike w:val="false"/>
+          <w:color w:val="000000"/>
+          <w:position w:val="0"/>
+          <w:sz w:val="20"/>
+          <w:szCs w:val="20"/>
+          <w:u w:val="none"/>
+          <w:shd w:fill="auto" w:val="clear"/>
+          <w:vertAlign w:val="baseline"/>
+        </w:rPr>
+        <w:t xml:space="preserve">     </w:t>
+      </w:r>
+      <w:r>
+        <w:rPr>
+          <w:rFonts w:eastAsia="Arial" w:cs="Arial"/>
+          <w:b/>
+          <w:bCs/>
+          <w:i w:val="false"/>
+          <w:iCs w:val="false"/>
+          <w:caps w:val="false"/>
+          <w:smallCaps w:val="false"/>
+          <w:strike w:val="false"/>
+          <w:dstrike w:val="false"/>
+          <w:color w:val="000000"/>
+          <w:position w:val="0"/>
+          <w:sz w:val="20"/>
+          <w:szCs w:val="20"/>
+          <w:u w:val="none"/>
+          <w:shd w:fill="auto" w:val="clear"/>
+          <w:vertAlign w:val="baseline"/>
+        </w:rPr>
+        <w:t>____________________________</w:t>
+      </w:r>
     </w:p>
     <w:p>
       <w:pPr>
         <w:pStyle w:val="normal1"/>
         <w:spacing w:lineRule="auto" w:line="240" w:before="194" w:after="0"/>
         <w:ind w:hanging="0" w:left="259"/>
-        <w:rPr>
-          <w:rFonts w:ascii="Arial" w:hAnsi="Arial" w:eastAsia="Arial" w:cs="Arial"/>
-          <w:b/>
-          <w:bCs/>
-          <w:sz w:val="20"/>
-          <w:szCs w:val="20"/>
-        </w:rPr>
+        <w:rPr/>
       </w:pPr>
       <w:r>
         <w:rPr>
@@ -3113,36 +3044,33 @@
           <w:b/>
           <w:bCs/>
           <w:i w:val="false"/>
-          <w:i w:val="false"/>
-          <w:iCs w:val="false"/>
-          <w:caps w:val="false"/>
-          <w:smallCaps w:val="false"/>
-          <w:strike w:val="false"/>
-          <w:dstrike w:val="false"/>
-          <w:color w:val="000000"/>
-          <w:position w:val="0"/>
-          <w:sz w:val="20"/>
-          <w:sz w:val="20"/>
-          <w:szCs w:val="20"/>
-          <w:u w:val="none"/>
-          <w:shd w:fill="auto" w:val="clear"/>
-          <w:vertAlign w:val="baseline"/>
-        </w:rPr>
-      </w:pPr>
-      <w:r>
-        <w:rPr>
-          <w:rFonts w:eastAsia="Arial" w:cs="Arial"/>
-          <w:b/>
-          <w:bCs/>
-          <w:i w:val="false"/>
-          <w:iCs w:val="false"/>
-          <w:caps w:val="false"/>
-          <w:smallCaps w:val="false"/>
-          <w:strike w:val="false"/>
-          <w:dstrike w:val="false"/>
-          <w:color w:val="000000"/>
-          <w:position w:val="0"/>
-          <w:sz w:val="20"/>
+          <w:iCs w:val="false"/>
+          <w:caps w:val="false"/>
+          <w:smallCaps w:val="false"/>
+          <w:strike w:val="false"/>
+          <w:dstrike w:val="false"/>
+          <w:color w:val="000000"/>
+          <w:position w:val="0"/>
+          <w:sz w:val="20"/>
+          <w:szCs w:val="20"/>
+          <w:u w:val="none"/>
+          <w:shd w:fill="auto" w:val="clear"/>
+          <w:vertAlign w:val="baseline"/>
+        </w:rPr>
+      </w:pPr>
+      <w:r>
+        <w:rPr>
+          <w:rFonts w:eastAsia="Arial" w:cs="Arial"/>
+          <w:b/>
+          <w:bCs/>
+          <w:i w:val="false"/>
+          <w:iCs w:val="false"/>
+          <w:caps w:val="false"/>
+          <w:smallCaps w:val="false"/>
+          <w:strike w:val="false"/>
+          <w:dstrike w:val="false"/>
+          <w:color w:val="000000"/>
+          <w:position w:val="0"/>
           <w:sz w:val="20"/>
           <w:szCs w:val="20"/>
           <w:u w:val="none"/>
@@ -3167,36 +3095,33 @@
           <w:b/>
           <w:bCs/>
           <w:i w:val="false"/>
-          <w:i w:val="false"/>
-          <w:iCs w:val="false"/>
-          <w:caps w:val="false"/>
-          <w:smallCaps w:val="false"/>
-          <w:strike w:val="false"/>
-          <w:dstrike w:val="false"/>
-          <w:color w:val="000000"/>
-          <w:position w:val="0"/>
-          <w:sz w:val="20"/>
-          <w:sz w:val="20"/>
-          <w:szCs w:val="20"/>
-          <w:u w:val="none"/>
-          <w:shd w:fill="auto" w:val="clear"/>
-          <w:vertAlign w:val="baseline"/>
-        </w:rPr>
-      </w:pPr>
-      <w:r>
-        <w:rPr>
-          <w:rFonts w:eastAsia="Arial" w:cs="Arial"/>
-          <w:b/>
-          <w:bCs/>
-          <w:i w:val="false"/>
-          <w:iCs w:val="false"/>
-          <w:caps w:val="false"/>
-          <w:smallCaps w:val="false"/>
-          <w:strike w:val="false"/>
-          <w:dstrike w:val="false"/>
-          <w:color w:val="000000"/>
-          <w:position w:val="0"/>
-          <w:sz w:val="20"/>
+          <w:iCs w:val="false"/>
+          <w:caps w:val="false"/>
+          <w:smallCaps w:val="false"/>
+          <w:strike w:val="false"/>
+          <w:dstrike w:val="false"/>
+          <w:color w:val="000000"/>
+          <w:position w:val="0"/>
+          <w:sz w:val="20"/>
+          <w:szCs w:val="20"/>
+          <w:u w:val="none"/>
+          <w:shd w:fill="auto" w:val="clear"/>
+          <w:vertAlign w:val="baseline"/>
+        </w:rPr>
+      </w:pPr>
+      <w:r>
+        <w:rPr>
+          <w:rFonts w:eastAsia="Arial" w:cs="Arial"/>
+          <w:b/>
+          <w:bCs/>
+          <w:i w:val="false"/>
+          <w:iCs w:val="false"/>
+          <w:caps w:val="false"/>
+          <w:smallCaps w:val="false"/>
+          <w:strike w:val="false"/>
+          <w:dstrike w:val="false"/>
+          <w:color w:val="000000"/>
+          <w:position w:val="0"/>
           <w:sz w:val="20"/>
           <w:szCs w:val="20"/>
           <w:u w:val="none"/>
@@ -3221,36 +3146,33 @@
           <w:b/>
           <w:bCs/>
           <w:i w:val="false"/>
-          <w:i w:val="false"/>
-          <w:iCs w:val="false"/>
-          <w:caps w:val="false"/>
-          <w:smallCaps w:val="false"/>
-          <w:strike w:val="false"/>
-          <w:dstrike w:val="false"/>
-          <w:color w:val="000000"/>
-          <w:position w:val="0"/>
-          <w:sz w:val="20"/>
-          <w:sz w:val="20"/>
-          <w:szCs w:val="20"/>
-          <w:u w:val="none"/>
-          <w:shd w:fill="auto" w:val="clear"/>
-          <w:vertAlign w:val="baseline"/>
-        </w:rPr>
-      </w:pPr>
-      <w:r>
-        <w:rPr>
-          <w:rFonts w:eastAsia="Arial" w:cs="Arial"/>
-          <w:b/>
-          <w:bCs/>
-          <w:i w:val="false"/>
-          <w:iCs w:val="false"/>
-          <w:caps w:val="false"/>
-          <w:smallCaps w:val="false"/>
-          <w:strike w:val="false"/>
-          <w:dstrike w:val="false"/>
-          <w:color w:val="000000"/>
-          <w:position w:val="0"/>
-          <w:sz w:val="20"/>
+          <w:iCs w:val="false"/>
+          <w:caps w:val="false"/>
+          <w:smallCaps w:val="false"/>
+          <w:strike w:val="false"/>
+          <w:dstrike w:val="false"/>
+          <w:color w:val="000000"/>
+          <w:position w:val="0"/>
+          <w:sz w:val="20"/>
+          <w:szCs w:val="20"/>
+          <w:u w:val="none"/>
+          <w:shd w:fill="auto" w:val="clear"/>
+          <w:vertAlign w:val="baseline"/>
+        </w:rPr>
+      </w:pPr>
+      <w:r>
+        <w:rPr>
+          <w:rFonts w:eastAsia="Arial" w:cs="Arial"/>
+          <w:b/>
+          <w:bCs/>
+          <w:i w:val="false"/>
+          <w:iCs w:val="false"/>
+          <w:caps w:val="false"/>
+          <w:smallCaps w:val="false"/>
+          <w:strike w:val="false"/>
+          <w:dstrike w:val="false"/>
+          <w:color w:val="000000"/>
+          <w:position w:val="0"/>
           <w:sz w:val="20"/>
           <w:szCs w:val="20"/>
           <w:u w:val="none"/>
@@ -3275,36 +3197,33 @@
           <w:b/>
           <w:bCs/>
           <w:i w:val="false"/>
-          <w:i w:val="false"/>
-          <w:iCs w:val="false"/>
-          <w:caps w:val="false"/>
-          <w:smallCaps w:val="false"/>
-          <w:strike w:val="false"/>
-          <w:dstrike w:val="false"/>
-          <w:color w:val="000000"/>
-          <w:position w:val="0"/>
-          <w:sz w:val="20"/>
-          <w:sz w:val="20"/>
-          <w:szCs w:val="20"/>
-          <w:u w:val="none"/>
-          <w:shd w:fill="auto" w:val="clear"/>
-          <w:vertAlign w:val="baseline"/>
-        </w:rPr>
-      </w:pPr>
-      <w:r>
-        <w:rPr>
-          <w:rFonts w:eastAsia="Arial" w:cs="Arial"/>
-          <w:b/>
-          <w:bCs/>
-          <w:i w:val="false"/>
-          <w:iCs w:val="false"/>
-          <w:caps w:val="false"/>
-          <w:smallCaps w:val="false"/>
-          <w:strike w:val="false"/>
-          <w:dstrike w:val="false"/>
-          <w:color w:val="000000"/>
-          <w:position w:val="0"/>
-          <w:sz w:val="20"/>
+          <w:iCs w:val="false"/>
+          <w:caps w:val="false"/>
+          <w:smallCaps w:val="false"/>
+          <w:strike w:val="false"/>
+          <w:dstrike w:val="false"/>
+          <w:color w:val="000000"/>
+          <w:position w:val="0"/>
+          <w:sz w:val="20"/>
+          <w:szCs w:val="20"/>
+          <w:u w:val="none"/>
+          <w:shd w:fill="auto" w:val="clear"/>
+          <w:vertAlign w:val="baseline"/>
+        </w:rPr>
+      </w:pPr>
+      <w:r>
+        <w:rPr>
+          <w:rFonts w:eastAsia="Arial" w:cs="Arial"/>
+          <w:b/>
+          <w:bCs/>
+          <w:i w:val="false"/>
+          <w:iCs w:val="false"/>
+          <w:caps w:val="false"/>
+          <w:smallCaps w:val="false"/>
+          <w:strike w:val="false"/>
+          <w:dstrike w:val="false"/>
+          <w:color w:val="000000"/>
+          <w:position w:val="0"/>
           <w:sz w:val="20"/>
           <w:szCs w:val="20"/>
           <w:u w:val="none"/>
@@ -3368,13 +3287,13 @@
         <w:ind w:left="485" w:hanging="226"/>
       </w:pPr>
       <w:rPr>
+        <w:rFonts w:ascii="Arial" w:hAnsi="Arial" w:eastAsia="Arial" w:cs="Arial"/>
+        <w:b w:val="false"/>
+        <w:bCs w:val="false"/>
+        <w:i w:val="false"/>
+        <w:iCs w:val="false"/>
         <w:sz w:val="20"/>
-        <w:i w:val="false"/>
-        <w:b w:val="false"/>
         <w:szCs w:val="20"/>
-        <w:iCs w:val="false"/>
-        <w:bCs w:val="false"/>
-        <w:rFonts w:ascii="Arial" w:hAnsi="Arial" w:eastAsia="Arial" w:cs="Arial"/>
       </w:rPr>
     </w:lvl>
     <w:lvl w:ilvl="1">
@@ -3663,7 +3582,7 @@
     </w:rPr>
   </w:style>
   <w:style w:type="paragraph" w:styleId="Heading1">
-    <w:name w:val="Heading 1"/>
+    <w:name w:val="heading 1"/>
     <w:basedOn w:val="normal1"/>
     <w:next w:val="normal1"/>
     <w:qFormat/>
@@ -3680,7 +3599,7 @@
     </w:rPr>
   </w:style>
   <w:style w:type="paragraph" w:styleId="Heading2">
-    <w:name w:val="Heading 2"/>
+    <w:name w:val="heading 2"/>
     <w:basedOn w:val="normal1"/>
     <w:next w:val="normal1"/>
     <w:qFormat/>
@@ -3698,7 +3617,7 @@
     </w:rPr>
   </w:style>
   <w:style w:type="paragraph" w:styleId="Heading3">
-    <w:name w:val="Heading 3"/>
+    <w:name w:val="heading 3"/>
     <w:basedOn w:val="normal1"/>
     <w:next w:val="normal1"/>
     <w:qFormat/>
@@ -3716,7 +3635,7 @@
     </w:rPr>
   </w:style>
   <w:style w:type="paragraph" w:styleId="Heading4">
-    <w:name w:val="Heading 4"/>
+    <w:name w:val="heading 4"/>
     <w:basedOn w:val="normal1"/>
     <w:next w:val="normal1"/>
     <w:qFormat/>
@@ -3734,7 +3653,7 @@
     </w:rPr>
   </w:style>
   <w:style w:type="paragraph" w:styleId="Heading5">
-    <w:name w:val="Heading 5"/>
+    <w:name w:val="heading 5"/>
     <w:basedOn w:val="normal1"/>
     <w:next w:val="normal1"/>
     <w:qFormat/>
@@ -3752,7 +3671,7 @@
     </w:rPr>
   </w:style>
   <w:style w:type="paragraph" w:styleId="Heading6">
-    <w:name w:val="Heading 6"/>
+    <w:name w:val="heading 6"/>
     <w:basedOn w:val="normal1"/>
     <w:next w:val="normal1"/>
     <w:qFormat/>
@@ -3777,8 +3696,8 @@
     <w:qFormat/>
     <w:rPr/>
   </w:style>
-  <w:style w:type="character" w:styleId="Bolos">
-    <w:name w:val="Bolos"/>
+  <w:style w:type="character" w:styleId="Bolosuser">
+    <w:name w:val="Bolos (user)"/>
     <w:qFormat/>
     <w:rPr>
       <w:rFonts w:ascii="OpenSymbol" w:hAnsi="OpenSymbol" w:eastAsia="OpenSymbol" w:cs="OpenSymbol"/>
@@ -3819,7 +3738,7 @@
     </w:rPr>
   </w:style>
   <w:style w:type="paragraph" w:styleId="Caption">
-    <w:name w:val="Caption"/>
+    <w:name w:val="caption"/>
     <w:basedOn w:val="Normal"/>
     <w:qFormat/>
     <w:pPr>
@@ -3836,6 +3755,32 @@
   </w:style>
   <w:style w:type="paragraph" w:styleId="ndice">
     <w:name w:val="Índice"/>
+    <w:basedOn w:val="Normal"/>
+    <w:qFormat/>
+    <w:pPr>
+      <w:suppressLineNumbers/>
+    </w:pPr>
+    <w:rPr>
+      <w:rFonts w:cs="Noto Sans Devanagari"/>
+    </w:rPr>
+  </w:style>
+  <w:style w:type="paragraph" w:styleId="Ttulouser">
+    <w:name w:val="Título (user)"/>
+    <w:basedOn w:val="Normal"/>
+    <w:next w:val="BodyText"/>
+    <w:qFormat/>
+    <w:pPr>
+      <w:keepNext w:val="true"/>
+      <w:spacing w:before="240" w:after="120"/>
+    </w:pPr>
+    <w:rPr>
+      <w:rFonts w:ascii="Liberation Sans" w:hAnsi="Liberation Sans" w:eastAsia="Noto Sans CJK SC" w:cs="Noto Sans Devanagari"/>
+      <w:sz w:val="28"/>
+      <w:szCs w:val="28"/>
+    </w:rPr>
+  </w:style>
+  <w:style w:type="paragraph" w:styleId="ndiceuser">
+    <w:name w:val="Índice (user)"/>
     <w:basedOn w:val="Normal"/>
     <w:qFormat/>
     <w:pPr>
@@ -3922,8 +3867,8 @@
       <w:szCs w:val="48"/>
     </w:rPr>
   </w:style>
-  <w:style w:type="numbering" w:styleId="Ningunalista" w:default="1">
-    <w:name w:val="Ninguna lista"/>
+  <w:style w:type="numbering" w:styleId="Ningunalistauser" w:default="1">
+    <w:name w:val="Ninguna lista (user)"/>
     <w:uiPriority w:val="99"/>
     <w:semiHidden/>
     <w:unhideWhenUsed/>
@@ -3980,34 +3925,34 @@
         <a:srgbClr val="000000"/>
       </a:dk1>
       <a:lt1>
-        <a:srgbClr val="ffffff"/>
+        <a:srgbClr val="FFFFFF"/>
       </a:lt1>
       <a:dk2>
-        <a:srgbClr val="1f497d"/>
+        <a:srgbClr val="1F497D"/>
       </a:dk2>
       <a:lt2>
-        <a:srgbClr val="eeece1"/>
+        <a:srgbClr val="EEECE1"/>
       </a:lt2>
       <a:accent1>
-        <a:srgbClr val="4f81bd"/>
+        <a:srgbClr val="4F81BD"/>
       </a:accent1>
       <a:accent2>
-        <a:srgbClr val="c0504d"/>
+        <a:srgbClr val="C0504D"/>
       </a:accent2>
       <a:accent3>
-        <a:srgbClr val="9bbb59"/>
+        <a:srgbClr val="9BBB59"/>
       </a:accent3>
       <a:accent4>
-        <a:srgbClr val="8064a2"/>
+        <a:srgbClr val="8064A2"/>
       </a:accent4>
       <a:accent5>
-        <a:srgbClr val="4bacc6"/>
+        <a:srgbClr val="4BACC6"/>
       </a:accent5>
       <a:accent6>
-        <a:srgbClr val="f79646"/>
+        <a:srgbClr val="F79646"/>
       </a:accent6>
       <a:hlink>
-        <a:srgbClr val="0000ff"/>
+        <a:srgbClr val="0000FF"/>
       </a:hlink>
       <a:folHlink>
         <a:srgbClr val="800080"/>

</xml_diff>

<commit_message>
fix(cesion-creditos): update and reorganize legal document templates
Consolidates `cesion_creditos` templates into the `inversiones` directory structure and ensures correct `hombre` and `mujer` versions are present and updated.
</commit_message>
<xml_diff>
--- a/apps/legal-docs-blueprints/templates/inversiones/cesion_creditos/cestion_creditos_hombre.docx
+++ b/apps/legal-docs-blueprints/templates/inversiones/cesion_creditos/cestion_creditos_hombre.docx
@@ -89,6 +89,10 @@
         <w:rPr/>
         <w:t xml:space="preserve">CONTRATO PRIVADO DE CESIÓN DE DERECHOS DE CARTERA DE CRÉDITO ENTRE LA ENTIDAD CUBE INVESTMENTS, SOCIEDAD ANÓNIMA Y </w:t>
       </w:r>
+      <w:r>
+        <w:rPr/>
+        <w:t>{nombreCompleto}</w:t>
+      </w:r>
       <w:sdt>
         <w:sdtPr>
           <w:tag w:val="goog_rdk_0"/>
@@ -100,7 +104,6 @@
           </w:r>
           <w:r>
             <w:rPr/>
-            <w:t>{nombreCompleto}</w:t>
           </w:r>
         </w:sdtContent>
       </w:sdt>
@@ -2804,9 +2807,9 @@
                           <a:avLst/>
                           <a:gdLst>
                             <a:gd name="textAreaLeft" fmla="*/ 0 w 720"/>
-                            <a:gd name="textAreaRight" fmla="*/ 3240 w 720"/>
+                            <a:gd name="textAreaRight" fmla="*/ 4680 w 720"/>
                             <a:gd name="textAreaTop" fmla="*/ 0 h 7200"/>
-                            <a:gd name="textAreaBottom" fmla="*/ 8640 h 7200"/>
+                            <a:gd name="textAreaBottom" fmla="*/ 9000 h 7200"/>
                           </a:gdLst>
                           <a:ahLst/>
                           <a:cxnLst/>
@@ -3256,8 +3259,7 @@
         </w:rPr>
       </w:r>
       <w:bookmarkStart w:id="0" w:name="_heading=h.2b497i1unvea"/>
-      <w:bookmarkStart w:id="1" w:name="_heading=h.2b497i1unvea"/>
-      <w:bookmarkEnd w:id="1"/>
+      <w:bookmarkEnd w:id="0"/>
     </w:p>
     <w:sectPr>
       <w:type w:val="nextPage"/>
@@ -3696,8 +3698,8 @@
     <w:qFormat/>
     <w:rPr/>
   </w:style>
-  <w:style w:type="character" w:styleId="Bolosuser">
-    <w:name w:val="Bolos (user)"/>
+  <w:style w:type="character" w:styleId="Bolos">
+    <w:name w:val="Bolos"/>
     <w:qFormat/>
     <w:rPr>
       <w:rFonts w:ascii="OpenSymbol" w:hAnsi="OpenSymbol" w:eastAsia="OpenSymbol" w:cs="OpenSymbol"/>
@@ -3867,8 +3869,8 @@
       <w:szCs w:val="48"/>
     </w:rPr>
   </w:style>
-  <w:style w:type="numbering" w:styleId="Ningunalistauser" w:default="1">
-    <w:name w:val="Ninguna lista (user)"/>
+  <w:style w:type="numbering" w:styleId="Ningunalista" w:default="1">
+    <w:name w:val="Ninguna lista"/>
     <w:uiPriority w:val="99"/>
     <w:semiHidden/>
     <w:unhideWhenUsed/>

</xml_diff>